<commit_message>
created new dir and moved file,grafana file created
</commit_message>
<xml_diff>
--- a/kubernates.docx
+++ b/kubernates.docx
@@ -2,95 +2,6 @@
 <file path=word/document.xml><?xml version="1.0" encoding="utf-8"?>
 <w:document xmlns:wpc="http://schemas.microsoft.com/office/word/2010/wordprocessingCanvas" xmlns:mc="http://schemas.openxmlformats.org/markup-compatibility/2006" xmlns:o="urn:schemas-microsoft-com:office:office" xmlns:r="http://schemas.openxmlformats.org/officeDocument/2006/relationships" xmlns:m="http://schemas.openxmlformats.org/officeDocument/2006/math" xmlns:v="urn:schemas-microsoft-com:vml" xmlns:wp="http://schemas.openxmlformats.org/drawingml/2006/wordprocessingDrawing" xmlns:w="http://schemas.openxmlformats.org/wordprocessingml/2006/main" xmlns:wpg="http://schemas.microsoft.com/office/word/2010/wordprocessingGroup" xmlns:wpi="http://schemas.microsoft.com/office/word/2010/wordprocessingInk" xmlns:a="http://schemas.openxmlformats.org/drawingml/2006/main" xmlns:wne="http://schemas.microsoft.com/office/word/2006/wordml" xmlns:wps="http://schemas.microsoft.com/office/word/2010/wordprocessingShape" xmlns:w10="urn:schemas-microsoft-com:office:word" xmlns:wp14="http://schemas.microsoft.com/office/word/2010/wordprocessingDrawing" xmlns:w14="http://schemas.microsoft.com/office/word/2010/wordml" xmlns:w15="http://schemas.microsoft.com/office/word/2012/wordml" xmlns:w16cex="http://schemas.microsoft.com/office/word/2018/wordml/cex" xmlns:w16cid="http://schemas.microsoft.com/office/word/2016/wordml/cid" xmlns:w16="http://schemas.microsoft.com/office/word/2018/wordml" xmlns:w16sdtdh="http://schemas.microsoft.com/office/word/2020/wordml/sdtdatahash" xmlns:w16se="http://schemas.microsoft.com/office/word/2015/wordml/symex" mc:Ignorable="w14 w15 w16se w16cid w16 w16cex w16sdtdh wp14">
   <w:body>
-    <w:p>
-      <w:pPr>
-        <w:pBdr/>
-        <w:spacing/>
-        <w:ind/>
-        <w:rPr>
-          <w:highlight w:val="none"/>
-        </w:rPr>
-      </w:pPr>
-      <w:r>
-        <mc:AlternateContent>
-          <mc:Choice Requires="wpg">
-            <w:drawing>
-              <wp:inline xmlns:wp="http://schemas.openxmlformats.org/drawingml/2006/wordprocessingDrawing" distT="0" distB="0" distL="0" distR="0">
-                <wp:extent cx="5943600" cy="3462890"/>
-                <wp:effectExtent l="0" t="0" r="0" b="0"/>
-                <wp:docPr id="1" name=""/>
-                <wp:cNvGraphicFramePr>
-                  <a:graphicFrameLocks xmlns:a="http://schemas.openxmlformats.org/drawingml/2006/main" noChangeAspect="1"/>
-                </wp:cNvGraphicFramePr>
-                <a:graphic xmlns:a="http://schemas.openxmlformats.org/drawingml/2006/main">
-                  <a:graphicData uri="http://schemas.openxmlformats.org/drawingml/2006/picture">
-                    <pic:pic xmlns:pic="http://schemas.openxmlformats.org/drawingml/2006/picture">
-                      <pic:nvPicPr>
-                        <pic:cNvPr id="637390887" name=""/>
-                        <pic:cNvPicPr>
-                          <a:picLocks noChangeAspect="1"/>
-                        </pic:cNvPicPr>
-                        <pic:nvPr/>
-                      </pic:nvPicPr>
-                      <pic:blipFill rotWithShape="1">
-                        <a:blip r:embed="rId9"/>
-                        <a:stretch/>
-                      </pic:blipFill>
-                      <pic:spPr bwMode="auto">
-                        <a:xfrm>
-                          <a:off x="0" y="0"/>
-                          <a:ext cx="5943599" cy="3462890"/>
-                        </a:xfrm>
-                        <a:prstGeom prst="rect">
-                          <a:avLst/>
-                        </a:prstGeom>
-                      </pic:spPr>
-                    </pic:pic>
-                  </a:graphicData>
-                </a:graphic>
-              </wp:inline>
-            </w:drawing>
-          </mc:Choice>
-          <mc:Fallback>
-            <w:pict>
-              <v:shapetype id="_x0000_t75" coordsize="21600,21600" o:spt="75" o:preferrelative="t" path="m@4@5l@4@11@9@11@9@5xe" filled="f" stroked="f">
-                <v:stroke joinstyle="miter"/>
-                <v:formulas>
-                  <v:f eqn="if lineDrawn pixelLineWidth 0"/>
-                  <v:f eqn="sum @0 1 0"/>
-                  <v:f eqn="sum 0 0 @1"/>
-                  <v:f eqn="prod @2 1 2"/>
-                  <v:f eqn="prod @3 21600 pixelWidth"/>
-                  <v:f eqn="prod @3 21600 pixelHeight"/>
-                  <v:f eqn="sum @0 0 1"/>
-                  <v:f eqn="prod @6 1 2"/>
-                  <v:f eqn="prod @7 21600 pixelWidth"/>
-                  <v:f eqn="sum @8 21600 0"/>
-                  <v:f eqn="prod @7 21600 pixelHeight"/>
-                  <v:f eqn="sum @10 21600 0"/>
-                </v:formulas>
-                <v:path o:extrusionok="f" gradientshapeok="t" o:connecttype="rect"/>
-                <o:lock v:ext="edit" aspectratio="t"/>
-              </v:shapetype>
-              <v:shape id="_x0000_i0" o:spid="_x0000_s0" type="#_x0000_t75" style="width:468.00pt;height:272.67pt;mso-wrap-distance-left:0.00pt;mso-wrap-distance-top:0.00pt;mso-wrap-distance-right:0.00pt;mso-wrap-distance-bottom:0.00pt;z-index:1;" stroked="false">
-                <v:imagedata r:id="rId9" o:title=""/>
-                <o:lock v:ext="edit" rotation="t"/>
-              </v:shape>
-            </w:pict>
-          </mc:Fallback>
-        </mc:AlternateContent>
-      </w:r>
-      <w:r>
-        <w:rPr>
-          <w:highlight w:val="none"/>
-        </w:rPr>
-      </w:r>
-      <w:r>
-        <w:rPr>
-          <w:highlight w:val="none"/>
-        </w:rPr>
-      </w:r>
-    </w:p>
     <w:p>
       <w:pPr>
         <w:pBdr/>
@@ -137,7 +48,7 @@
               <wp:inline xmlns:wp="http://schemas.openxmlformats.org/drawingml/2006/wordprocessingDrawing" distT="0" distB="0" distL="0" distR="0">
                 <wp:extent cx="5943600" cy="2964569"/>
                 <wp:effectExtent l="0" t="0" r="0" b="0"/>
-                <wp:docPr id="2" name=""/>
+                <wp:docPr id="1" name=""/>
                 <wp:cNvGraphicFramePr>
                   <a:graphicFrameLocks xmlns:a="http://schemas.openxmlformats.org/drawingml/2006/main" noChangeAspect="1"/>
                 </wp:cNvGraphicFramePr>
@@ -152,7 +63,7 @@
                         <pic:nvPr/>
                       </pic:nvPicPr>
                       <pic:blipFill rotWithShape="1">
-                        <a:blip r:embed="rId10"/>
+                        <a:blip r:embed="rId9"/>
                         <a:stretch/>
                       </pic:blipFill>
                       <pic:spPr bwMode="auto">
@@ -191,8 +102,8 @@
                 <v:path o:extrusionok="f" gradientshapeok="t" o:connecttype="rect"/>
                 <o:lock v:ext="edit" aspectratio="t"/>
               </v:shapetype>
-              <v:shape id="_x0000_i1" o:spid="_x0000_s1" type="#_x0000_t75" style="width:468.00pt;height:233.43pt;mso-wrap-distance-left:0.00pt;mso-wrap-distance-top:0.00pt;mso-wrap-distance-right:0.00pt;mso-wrap-distance-bottom:0.00pt;z-index:1;" stroked="false">
-                <v:imagedata r:id="rId10" o:title=""/>
+              <v:shape id="_x0000_i0" o:spid="_x0000_s0" type="#_x0000_t75" style="width:468.00pt;height:233.43pt;mso-wrap-distance-left:0.00pt;mso-wrap-distance-top:0.00pt;mso-wrap-distance-right:0.00pt;mso-wrap-distance-bottom:0.00pt;z-index:1;" stroked="false">
+                <v:imagedata r:id="rId9" o:title=""/>
                 <o:lock v:ext="edit" rotation="t"/>
               </v:shape>
             </w:pict>
@@ -315,7 +226,7 @@
               <wp:inline xmlns:wp="http://schemas.openxmlformats.org/drawingml/2006/wordprocessingDrawing" distT="0" distB="0" distL="0" distR="0">
                 <wp:extent cx="5943600" cy="2673893"/>
                 <wp:effectExtent l="0" t="0" r="0" b="0"/>
-                <wp:docPr id="3" name=""/>
+                <wp:docPr id="2" name=""/>
                 <wp:cNvGraphicFramePr>
                   <a:graphicFrameLocks xmlns:a="http://schemas.openxmlformats.org/drawingml/2006/main" noChangeAspect="1"/>
                 </wp:cNvGraphicFramePr>
@@ -330,7 +241,7 @@
                         <pic:nvPr/>
                       </pic:nvPicPr>
                       <pic:blipFill rotWithShape="1">
-                        <a:blip r:embed="rId11"/>
+                        <a:blip r:embed="rId10"/>
                         <a:stretch/>
                       </pic:blipFill>
                       <pic:spPr bwMode="auto">
@@ -369,8 +280,8 @@
                 <v:path o:extrusionok="f" gradientshapeok="t" o:connecttype="rect"/>
                 <o:lock v:ext="edit" aspectratio="t"/>
               </v:shapetype>
-              <v:shape id="_x0000_i2" o:spid="_x0000_s2" type="#_x0000_t75" style="width:468.00pt;height:210.54pt;mso-wrap-distance-left:0.00pt;mso-wrap-distance-top:0.00pt;mso-wrap-distance-right:0.00pt;mso-wrap-distance-bottom:0.00pt;z-index:1;" stroked="false">
-                <v:imagedata r:id="rId11" o:title=""/>
+              <v:shape id="_x0000_i1" o:spid="_x0000_s1" type="#_x0000_t75" style="width:468.00pt;height:210.54pt;mso-wrap-distance-left:0.00pt;mso-wrap-distance-top:0.00pt;mso-wrap-distance-right:0.00pt;mso-wrap-distance-bottom:0.00pt;z-index:1;" stroked="false">
+                <v:imagedata r:id="rId10" o:title=""/>
                 <o:lock v:ext="edit" rotation="t"/>
               </v:shape>
             </w:pict>
@@ -609,6 +520,148 @@
           <w:highlight w:val="none"/>
         </w:rPr>
         <w:t xml:space="preserve">kubectl get pods -o wide</w:t>
+      </w:r>
+      <w:r>
+        <w:rPr>
+          <w:highlight w:val="none"/>
+        </w:rPr>
+      </w:r>
+      <w:r>
+        <w:rPr>
+          <w:highlight w:val="none"/>
+        </w:rPr>
+      </w:r>
+    </w:p>
+    <w:p>
+      <w:pPr>
+        <w:pBdr/>
+        <w:spacing/>
+        <w:ind w:firstLine="708"/>
+        <w:rPr>
+          <w:highlight w:val="none"/>
+        </w:rPr>
+      </w:pPr>
+      <w:r>
+        <w:rPr>
+          <w:highlight w:val="none"/>
+        </w:rPr>
+      </w:r>
+      <w:r>
+        <w:rPr>
+          <w:highlight w:val="none"/>
+        </w:rPr>
+        <w:t xml:space="preserve">kubectl delete deployment nginx-deployment</w:t>
+      </w:r>
+      <w:r>
+        <w:rPr>
+          <w:highlight w:val="none"/>
+        </w:rPr>
+      </w:r>
+      <w:r>
+        <w:rPr>
+          <w:highlight w:val="none"/>
+        </w:rPr>
+      </w:r>
+      <w:r>
+        <w:rPr>
+          <w:highlight w:val="none"/>
+        </w:rPr>
+      </w:r>
+    </w:p>
+    <w:p>
+      <w:pPr>
+        <w:pBdr/>
+        <w:spacing/>
+        <w:ind w:firstLine="708"/>
+        <w:rPr>
+          <w:highlight w:val="none"/>
+        </w:rPr>
+      </w:pPr>
+      <w:r>
+        <w:rPr>
+          <w:highlight w:val="none"/>
+        </w:rPr>
+      </w:r>
+      <w:r>
+        <w:rPr>
+          <w:highlight w:val="none"/>
+        </w:rPr>
+      </w:r>
+      <w:r>
+        <w:rPr>
+          <w:highlight w:val="none"/>
+        </w:rPr>
+        <w:t xml:space="preserve">kubectl delete -f blog-deployment.yaml</w:t>
+      </w:r>
+      <w:r>
+        <w:rPr>
+          <w:highlight w:val="none"/>
+        </w:rPr>
+        <w:t xml:space="preserve"> ## Delete deployment using config file</w:t>
+      </w:r>
+      <w:r>
+        <w:rPr>
+          <w:highlight w:val="none"/>
+        </w:rPr>
+      </w:r>
+    </w:p>
+    <w:p>
+      <w:pPr>
+        <w:pBdr/>
+        <w:spacing/>
+        <w:ind w:firstLine="708"/>
+        <w:rPr>
+          <w:highlight w:val="none"/>
+        </w:rPr>
+      </w:pPr>
+      <w:r>
+        <w:rPr>
+          <w:highlight w:val="none"/>
+        </w:rPr>
+      </w:r>
+      <w:r>
+        <w:rPr>
+          <w:rFonts w:ascii="Liberation Sans" w:hAnsi="Liberation Sans" w:eastAsia="Liberation Sans" w:cs="Liberation Sans"/>
+          <w:color w:val="000000"/>
+          <w:sz w:val="21"/>
+        </w:rPr>
+        <w:t xml:space="preserve">kubectl get deployments --all-namespaces</w:t>
+      </w:r>
+      <w:r>
+        <w:rPr>
+          <w:highlight w:val="none"/>
+        </w:rPr>
+      </w:r>
+      <w:r>
+        <w:rPr>
+          <w:highlight w:val="none"/>
+        </w:rPr>
+      </w:r>
+    </w:p>
+    <w:p>
+      <w:pPr>
+        <w:pBdr/>
+        <w:spacing/>
+        <w:ind w:firstLine="708"/>
+        <w:rPr>
+          <w:highlight w:val="none"/>
+        </w:rPr>
+      </w:pPr>
+      <w:r>
+        <w:rPr>
+          <w:highlight w:val="none"/>
+        </w:rPr>
+      </w:r>
+      <w:r>
+        <w:rPr>
+          <w:highlight w:val="none"/>
+        </w:rPr>
+        <w:t xml:space="preserve">kubectl scale deployment myblog-wordpress --replicas=10</w:t>
+      </w:r>
+      <w:r>
+        <w:rPr>
+          <w:highlight w:val="none"/>
+        </w:rPr>
       </w:r>
       <w:r>
         <w:rPr>
@@ -788,6 +841,609 @@
           <w:highlight w:val="none"/>
         </w:rPr>
       </w:r>
+      <w:r>
+        <w:rPr>
+          <w:highlight w:val="none"/>
+        </w:rPr>
+      </w:r>
+      <w:r>
+        <w:rPr>
+          <w:highlight w:val="none"/>
+        </w:rPr>
+      </w:r>
+      <w:r>
+        <w:rPr>
+          <w:highlight w:val="none"/>
+        </w:rPr>
+      </w:r>
+      <w:r>
+        <w:rPr>
+          <w:highlight w:val="none"/>
+        </w:rPr>
+      </w:r>
+    </w:p>
+    <w:p>
+      <w:pPr>
+        <w:pBdr/>
+        <w:spacing/>
+        <w:ind w:firstLine="0" w:left="0"/>
+        <w:rPr>
+          <w:highlight w:val="none"/>
+        </w:rPr>
+      </w:pPr>
+      <w:r>
+        <w:rPr>
+          <w:highlight w:val="none"/>
+        </w:rPr>
+      </w:r>
+      <w:r>
+        <w:t xml:space="preserve">Pod</w:t>
+        <w:br/>
+        <w:t xml:space="preserve"> ├── Container 1 (wordpress)</w:t>
+        <w:br/>
+        <w:t xml:space="preserve"> ├── Container 2 (sidecar)</w:t>
+        <w:br/>
+        <w:t xml:space="preserve"> └── Shared Network + Storage</w:t>
+      </w:r>
+      <w:r>
+        <w:rPr>
+          <w:highlight w:val="none"/>
+        </w:rPr>
+      </w:r>
+      <w:r>
+        <w:rPr>
+          <w:highlight w:val="none"/>
+        </w:rPr>
+      </w:r>
+      <w:r>
+        <w:rPr>
+          <w:highlight w:val="none"/>
+        </w:rPr>
+      </w:r>
+    </w:p>
+    <w:p>
+      <w:pPr>
+        <w:pBdr/>
+        <w:spacing/>
+        <w:ind w:firstLine="0" w:left="0"/>
+        <w:rPr>
+          <w:highlight w:val="none"/>
+        </w:rPr>
+      </w:pPr>
+      <w:r>
+        <w:rPr>
+          <w:highlight w:val="none"/>
+        </w:rPr>
+      </w:r>
+      <w:r>
+        <w:t xml:space="preserve">A Pod can contain one or more containers.</w:t>
+      </w:r>
+      <w:r>
+        <w:rPr>
+          <w:highlight w:val="none"/>
+        </w:rPr>
+      </w:r>
+      <w:r>
+        <w:rPr>
+          <w:highlight w:val="none"/>
+        </w:rPr>
+      </w:r>
+    </w:p>
+    <w:p>
+      <w:pPr>
+        <w:pBdr/>
+        <w:spacing/>
+        <w:ind w:firstLine="0" w:left="0"/>
+        <w:rPr>
+          <w:highlight w:val="none"/>
+        </w:rPr>
+      </w:pPr>
+      <w:r>
+        <w:rPr>
+          <w:highlight w:val="none"/>
+        </w:rPr>
+      </w:r>
+      <w:r>
+        <w:rPr>
+          <w:highlight w:val="none"/>
+        </w:rPr>
+      </w:r>
+      <w:r>
+        <w:rPr>
+          <w:highlight w:val="none"/>
+        </w:rPr>
+      </w:r>
+    </w:p>
+    <w:p>
+      <w:pPr>
+        <w:pBdr/>
+        <w:spacing/>
+        <w:ind w:firstLine="0" w:left="0"/>
+        <w:rPr>
+          <w:highlight w:val="none"/>
+        </w:rPr>
+      </w:pPr>
+      <w:r>
+        <w:rPr>
+          <w:highlight w:val="none"/>
+        </w:rPr>
+      </w:r>
+      <w:r>
+        <w:rPr>
+          <w:highlight w:val="none"/>
+        </w:rPr>
+      </w:r>
+      <w:r>
+        <w:rPr>
+          <w:highlight w:val="none"/>
+        </w:rPr>
+      </w:r>
+    </w:p>
+    <w:p>
+      <w:pPr>
+        <w:pBdr/>
+        <w:spacing/>
+        <w:ind w:firstLine="0" w:left="0"/>
+        <w:rPr>
+          <w:highlight w:val="none"/>
+        </w:rPr>
+      </w:pPr>
+      <w:r>
+        <w:rPr>
+          <w:highlight w:val="none"/>
+        </w:rPr>
+      </w:r>
+      <w:r>
+        <w:rPr>
+          <w:highlight w:val="none"/>
+        </w:rPr>
+      </w:r>
+      <w:r>
+        <w:rPr>
+          <w:highlight w:val="none"/>
+        </w:rPr>
+      </w:r>
+    </w:p>
+    <w:p>
+      <w:pPr>
+        <w:pBdr/>
+        <w:spacing/>
+        <w:ind w:firstLine="0" w:left="0"/>
+        <w:rPr>
+          <w:highlight w:val="none"/>
+        </w:rPr>
+      </w:pPr>
+      <w:r>
+        <w:rPr>
+          <w:highlight w:val="none"/>
+        </w:rPr>
+      </w:r>
+      <w:r>
+        <w:rPr>
+          <w:highlight w:val="none"/>
+        </w:rPr>
+      </w:r>
+      <w:r>
+        <w:rPr>
+          <w:highlight w:val="none"/>
+        </w:rPr>
+      </w:r>
+    </w:p>
+    <w:p>
+      <w:pPr>
+        <w:pBdr/>
+        <w:spacing/>
+        <w:ind w:firstLine="0" w:left="0"/>
+        <w:rPr>
+          <w:highlight w:val="none"/>
+        </w:rPr>
+      </w:pPr>
+      <w:r>
+        <w:rPr>
+          <w:highlight w:val="none"/>
+        </w:rPr>
+      </w:r>
+      <w:r>
+        <w:rPr>
+          <w:highlight w:val="none"/>
+        </w:rPr>
+      </w:r>
+      <w:r>
+        <w:rPr>
+          <w:highlight w:val="none"/>
+        </w:rPr>
+      </w:r>
+    </w:p>
+    <w:p>
+      <w:pPr>
+        <w:pBdr/>
+        <w:spacing/>
+        <w:ind w:firstLine="0" w:left="0"/>
+        <w:rPr>
+          <w:highlight w:val="none"/>
+        </w:rPr>
+      </w:pPr>
+      <w:r>
+        <w:rPr>
+          <w:highlight w:val="none"/>
+        </w:rPr>
+      </w:r>
+      <w:r>
+        <w:rPr>
+          <w:highlight w:val="none"/>
+        </w:rPr>
+      </w:r>
+      <w:r>
+        <w:rPr>
+          <w:highlight w:val="none"/>
+        </w:rPr>
+      </w:r>
+    </w:p>
+    <w:p>
+      <w:pPr>
+        <w:pBdr/>
+        <w:spacing/>
+        <w:ind w:firstLine="0" w:left="0"/>
+        <w:rPr>
+          <w:highlight w:val="none"/>
+        </w:rPr>
+      </w:pPr>
+      <w:r>
+        <w:rPr>
+          <w:highlight w:val="none"/>
+        </w:rPr>
+      </w:r>
+      <w:r>
+        <w:rPr>
+          <w:highlight w:val="none"/>
+        </w:rPr>
+      </w:r>
+      <w:r>
+        <w:rPr>
+          <w:highlight w:val="none"/>
+        </w:rPr>
+      </w:r>
+    </w:p>
+    <w:p>
+      <w:pPr>
+        <w:pStyle w:val="837"/>
+        <w:pBdr>
+          <w:top w:val="none" w:color="000000" w:sz="4" w:space="0"/>
+          <w:left w:val="none" w:color="000000" w:sz="4" w:space="0"/>
+          <w:bottom w:val="none" w:color="000000" w:sz="4" w:space="0"/>
+          <w:right w:val="none" w:color="000000" w:sz="4" w:space="0"/>
+        </w:pBdr>
+        <w:spacing/>
+        <w:ind w:right="0" w:firstLine="0" w:left="0"/>
+        <w:rPr/>
+      </w:pPr>
+      <w:r>
+        <w:rPr>
+          <w:rFonts w:ascii="Times New Roman" w:hAnsi="Times New Roman" w:eastAsia="Times New Roman" w:cs="Times New Roman"/>
+          <w:b/>
+          <w:color w:val="000000"/>
+          <w:sz w:val="48"/>
+        </w:rPr>
+        <w:t xml:space="preserve">The rule I want you to remember forever</w:t>
+      </w:r>
+      <w:r/>
+    </w:p>
+    <w:p>
+      <w:pPr>
+        <w:pStyle w:val="838"/>
+        <w:pBdr>
+          <w:top w:val="none" w:color="000000" w:sz="4" w:space="0"/>
+          <w:left w:val="none" w:color="000000" w:sz="4" w:space="0"/>
+          <w:bottom w:val="none" w:color="000000" w:sz="4" w:space="0"/>
+          <w:right w:val="none" w:color="000000" w:sz="4" w:space="0"/>
+        </w:pBdr>
+        <w:spacing/>
+        <w:ind w:right="0" w:firstLine="0" w:left="0"/>
+        <w:rPr/>
+      </w:pPr>
+      <w:r>
+        <w:rPr>
+          <w:rFonts w:ascii="Times New Roman" w:hAnsi="Times New Roman" w:eastAsia="Times New Roman" w:cs="Times New Roman"/>
+          <w:b/>
+          <w:color w:val="000000"/>
+          <w:sz w:val="36"/>
+        </w:rPr>
+        <w:t xml:space="preserve">kubelet manages containers</w:t>
+      </w:r>
+      <w:r/>
+    </w:p>
+    <w:p>
+      <w:pPr>
+        <w:pBdr>
+          <w:top w:val="none" w:color="000000" w:sz="4" w:space="0"/>
+          <w:left w:val="none" w:color="000000" w:sz="4" w:space="0"/>
+          <w:bottom w:val="none" w:color="000000" w:sz="4" w:space="0"/>
+          <w:right w:val="none" w:color="000000" w:sz="4" w:space="0"/>
+        </w:pBdr>
+        <w:spacing/>
+        <w:ind w:right="0" w:firstLine="0" w:left="0"/>
+        <w:rPr/>
+      </w:pPr>
+      <w:r>
+        <w:rPr>
+          <w:rFonts w:ascii="Courier New" w:hAnsi="Courier New" w:eastAsia="Courier New" w:cs="Courier New"/>
+          <w:color w:val="000000"/>
+          <w:sz w:val="20"/>
+        </w:rPr>
+        <w:t xml:space="preserve">Container crashes</w:t>
+        <w:br/>
+        <w:br/>
+        <w:t xml:space="preserve">↓</w:t>
+        <w:br/>
+        <w:br/>
+        <w:t xml:space="preserve">kubelet</w:t>
+        <w:br/>
+        <w:br/>
+        <w:t xml:space="preserve">↓</w:t>
+        <w:br/>
+        <w:br/>
+        <w:t xml:space="preserve">Restart container</w:t>
+        <w:br/>
+        <w:br/>
+        <w:t xml:space="preserve">↓</w:t>
+        <w:br/>
+        <w:br/>
+        <w:t xml:space="preserve">Same Pod</w:t>
+      </w:r>
+      <w:r/>
+    </w:p>
+    <w:p>
+      <w:pPr>
+        <w:pStyle w:val="838"/>
+        <w:pBdr>
+          <w:top w:val="none" w:color="000000" w:sz="4" w:space="0"/>
+          <w:left w:val="none" w:color="000000" w:sz="4" w:space="0"/>
+          <w:bottom w:val="none" w:color="000000" w:sz="4" w:space="0"/>
+          <w:right w:val="none" w:color="000000" w:sz="4" w:space="0"/>
+        </w:pBdr>
+        <w:spacing/>
+        <w:ind w:right="0" w:firstLine="0" w:left="0"/>
+        <w:rPr/>
+      </w:pPr>
+      <w:r>
+        <w:rPr>
+          <w:rFonts w:ascii="Times New Roman" w:hAnsi="Times New Roman" w:eastAsia="Times New Roman" w:cs="Times New Roman"/>
+          <w:b/>
+          <w:color w:val="000000"/>
+          <w:sz w:val="36"/>
+        </w:rPr>
+        <w:t xml:space="preserve">ReplicaSet manages Pods</w:t>
+      </w:r>
+      <w:r/>
+    </w:p>
+    <w:p>
+      <w:pPr>
+        <w:pBdr>
+          <w:top w:val="none" w:color="000000" w:sz="4" w:space="0"/>
+          <w:left w:val="none" w:color="000000" w:sz="4" w:space="0"/>
+          <w:bottom w:val="none" w:color="000000" w:sz="4" w:space="0"/>
+          <w:right w:val="none" w:color="000000" w:sz="4" w:space="0"/>
+        </w:pBdr>
+        <w:spacing/>
+        <w:ind w:right="0" w:firstLine="0" w:left="0"/>
+        <w:rPr/>
+      </w:pPr>
+      <w:r>
+        <w:rPr>
+          <w:rFonts w:ascii="Courier New" w:hAnsi="Courier New" w:eastAsia="Courier New" w:cs="Courier New"/>
+          <w:color w:val="000000"/>
+          <w:sz w:val="20"/>
+        </w:rPr>
+        <w:t xml:space="preserve">Pod deleted</w:t>
+        <w:br/>
+        <w:br/>
+        <w:t xml:space="preserve">↓</w:t>
+        <w:br/>
+        <w:br/>
+        <w:t xml:space="preserve">ReplicaSet Controller</w:t>
+        <w:br/>
+        <w:br/>
+        <w:t xml:space="preserve">↓</w:t>
+        <w:br/>
+        <w:br/>
+        <w:t xml:space="preserve">Create new Pod</w:t>
+        <w:br/>
+        <w:br/>
+        <w:t xml:space="preserve">↓</w:t>
+        <w:br/>
+        <w:br/>
+        <w:t xml:space="preserve">New Pod name</w:t>
+      </w:r>
+      <w:r/>
+    </w:p>
+    <w:p>
+      <w:pPr>
+        <w:pStyle w:val="837"/>
+        <w:pBdr>
+          <w:top w:val="none" w:color="000000" w:sz="4" w:space="0"/>
+          <w:left w:val="none" w:color="000000" w:sz="4" w:space="0"/>
+          <w:bottom w:val="none" w:color="000000" w:sz="4" w:space="0"/>
+          <w:right w:val="none" w:color="000000" w:sz="4" w:space="0"/>
+        </w:pBdr>
+        <w:spacing/>
+        <w:ind w:right="0" w:firstLine="0" w:left="0"/>
+        <w:rPr/>
+      </w:pPr>
+      <w:r>
+        <w:rPr>
+          <w:rFonts w:ascii="Times New Roman" w:hAnsi="Times New Roman" w:eastAsia="Times New Roman" w:cs="Times New Roman"/>
+          <w:b/>
+          <w:color w:val="000000"/>
+          <w:sz w:val="48"/>
+        </w:rPr>
+        <w:t xml:space="preserve">Golden Rule</w:t>
+      </w:r>
+      <w:r/>
+    </w:p>
+    <w:p>
+      <w:pPr>
+        <w:pBdr>
+          <w:top w:val="none" w:color="000000" w:sz="4" w:space="0"/>
+          <w:left w:val="none" w:color="000000" w:sz="4" w:space="0"/>
+          <w:bottom w:val="none" w:color="000000" w:sz="4" w:space="0"/>
+          <w:right w:val="none" w:color="000000" w:sz="4" w:space="0"/>
+        </w:pBdr>
+        <w:spacing/>
+        <w:ind w:right="0" w:firstLine="0" w:left="0"/>
+        <w:rPr/>
+      </w:pPr>
+      <w:r>
+        <w:rPr>
+          <w:rFonts w:ascii="Times New Roman" w:hAnsi="Times New Roman" w:eastAsia="Times New Roman" w:cs="Times New Roman"/>
+          <w:b/>
+          <w:color w:val="000000"/>
+          <w:sz w:val="24"/>
+        </w:rPr>
+        <w:t xml:space="preserve">kubelet is responsible for the lifecycle of containers inside a Pod.</w:t>
+      </w:r>
+      <w:r/>
+    </w:p>
+    <w:p>
+      <w:pPr>
+        <w:pBdr>
+          <w:top w:val="none" w:color="000000" w:sz="4" w:space="0"/>
+          <w:left w:val="none" w:color="000000" w:sz="4" w:space="0"/>
+          <w:bottom w:val="none" w:color="000000" w:sz="4" w:space="0"/>
+          <w:right w:val="none" w:color="000000" w:sz="4" w:space="0"/>
+        </w:pBdr>
+        <w:spacing/>
+        <w:ind w:right="0" w:firstLine="0" w:left="0"/>
+        <w:rPr/>
+      </w:pPr>
+      <w:r>
+        <w:rPr>
+          <w:rFonts w:ascii="Times New Roman" w:hAnsi="Times New Roman" w:eastAsia="Times New Roman" w:cs="Times New Roman"/>
+          <w:b/>
+          <w:color w:val="000000"/>
+          <w:sz w:val="24"/>
+        </w:rPr>
+        <w:t xml:space="preserve">ReplicaSet Controller is responsible for maintaining the desired number of Pods.</w:t>
+      </w:r>
+      <w:r/>
+    </w:p>
+    <w:p>
+      <w:pPr>
+        <w:pBdr/>
+        <w:spacing/>
+        <w:ind w:firstLine="0" w:left="0"/>
+        <w:rPr>
+          <w:highlight w:val="none"/>
+        </w:rPr>
+      </w:pPr>
+      <w:r>
+        <w:rPr>
+          <w:highlight w:val="none"/>
+        </w:rPr>
+      </w:r>
+      <w:r>
+        <w:rPr>
+          <w:highlight w:val="none"/>
+        </w:rPr>
+      </w:r>
+      <w:r>
+        <w:rPr>
+          <w:highlight w:val="none"/>
+        </w:rPr>
+      </w:r>
+    </w:p>
+    <w:p>
+      <w:pPr>
+        <w:pBdr/>
+        <w:spacing/>
+        <w:ind w:firstLine="0" w:left="0"/>
+        <w:rPr>
+          <w:highlight w:val="none"/>
+        </w:rPr>
+      </w:pPr>
+      <w:r>
+        <w:rPr>
+          <w:highlight w:val="none"/>
+        </w:rPr>
+      </w:r>
+      <w:r>
+        <mc:AlternateContent>
+          <mc:Choice Requires="wpg">
+            <w:drawing>
+              <wp:inline xmlns:wp="http://schemas.openxmlformats.org/drawingml/2006/wordprocessingDrawing" distT="0" distB="0" distL="0" distR="0">
+                <wp:extent cx="5943600" cy="3368932"/>
+                <wp:effectExtent l="0" t="0" r="0" b="0"/>
+                <wp:docPr id="3" name=""/>
+                <wp:cNvGraphicFramePr>
+                  <a:graphicFrameLocks xmlns:a="http://schemas.openxmlformats.org/drawingml/2006/main" noChangeAspect="1"/>
+                </wp:cNvGraphicFramePr>
+                <a:graphic xmlns:a="http://schemas.openxmlformats.org/drawingml/2006/main">
+                  <a:graphicData uri="http://schemas.openxmlformats.org/drawingml/2006/picture">
+                    <pic:pic xmlns:pic="http://schemas.openxmlformats.org/drawingml/2006/picture">
+                      <pic:nvPicPr>
+                        <pic:cNvPr id="820135865" name=""/>
+                        <pic:cNvPicPr>
+                          <a:picLocks noChangeAspect="1"/>
+                        </pic:cNvPicPr>
+                        <pic:nvPr/>
+                      </pic:nvPicPr>
+                      <pic:blipFill rotWithShape="1">
+                        <a:blip r:embed="rId11"/>
+                        <a:stretch/>
+                      </pic:blipFill>
+                      <pic:spPr bwMode="auto">
+                        <a:xfrm>
+                          <a:off x="0" y="0"/>
+                          <a:ext cx="5943599" cy="3368932"/>
+                        </a:xfrm>
+                        <a:prstGeom prst="rect">
+                          <a:avLst/>
+                        </a:prstGeom>
+                      </pic:spPr>
+                    </pic:pic>
+                  </a:graphicData>
+                </a:graphic>
+              </wp:inline>
+            </w:drawing>
+          </mc:Choice>
+          <mc:Fallback>
+            <w:pict>
+              <v:shapetype id="_x0000_t75" coordsize="21600,21600" o:spt="75" o:preferrelative="t" path="m@4@5l@4@11@9@11@9@5xe" filled="f" stroked="f">
+                <v:stroke joinstyle="miter"/>
+                <v:formulas>
+                  <v:f eqn="if lineDrawn pixelLineWidth 0"/>
+                  <v:f eqn="sum @0 1 0"/>
+                  <v:f eqn="sum 0 0 @1"/>
+                  <v:f eqn="prod @2 1 2"/>
+                  <v:f eqn="prod @3 21600 pixelWidth"/>
+                  <v:f eqn="prod @3 21600 pixelHeight"/>
+                  <v:f eqn="sum @0 0 1"/>
+                  <v:f eqn="prod @6 1 2"/>
+                  <v:f eqn="prod @7 21600 pixelWidth"/>
+                  <v:f eqn="sum @8 21600 0"/>
+                  <v:f eqn="prod @7 21600 pixelHeight"/>
+                  <v:f eqn="sum @10 21600 0"/>
+                </v:formulas>
+                <v:path o:extrusionok="f" gradientshapeok="t" o:connecttype="rect"/>
+                <o:lock v:ext="edit" aspectratio="t"/>
+              </v:shapetype>
+              <v:shape id="_x0000_i2" o:spid="_x0000_s2" type="#_x0000_t75" style="width:468.00pt;height:265.27pt;mso-wrap-distance-left:0.00pt;mso-wrap-distance-top:0.00pt;mso-wrap-distance-right:0.00pt;mso-wrap-distance-bottom:0.00pt;z-index:1;" stroked="false">
+                <v:imagedata r:id="rId11" o:title=""/>
+                <o:lock v:ext="edit" rotation="t"/>
+              </v:shape>
+            </w:pict>
+          </mc:Fallback>
+        </mc:AlternateContent>
+      </w:r>
+      <w:r>
+        <w:rPr>
+          <w:highlight w:val="none"/>
+        </w:rPr>
+      </w:r>
+      <w:r>
+        <w:rPr>
+          <w:highlight w:val="none"/>
+        </w:rPr>
+      </w:r>
     </w:p>
     <w:p>
       <w:pPr>
@@ -818,7 +1474,7 @@
                   <a:graphicData uri="http://schemas.openxmlformats.org/drawingml/2006/picture">
                     <pic:pic xmlns:pic="http://schemas.openxmlformats.org/drawingml/2006/picture">
                       <pic:nvPicPr>
-                        <pic:cNvPr id="820135865" name=""/>
+                        <pic:cNvPr id="102825216" name=""/>
                         <pic:cNvPicPr>
                           <a:picLocks noChangeAspect="1"/>
                         </pic:cNvPicPr>
@@ -898,100 +1554,6 @@
         </w:rPr>
       </w:r>
       <w:r>
-        <mc:AlternateContent>
-          <mc:Choice Requires="wpg">
-            <w:drawing>
-              <wp:inline xmlns:wp="http://schemas.openxmlformats.org/drawingml/2006/wordprocessingDrawing" distT="0" distB="0" distL="0" distR="0">
-                <wp:extent cx="5943600" cy="3368932"/>
-                <wp:effectExtent l="0" t="0" r="0" b="0"/>
-                <wp:docPr id="5" name=""/>
-                <wp:cNvGraphicFramePr>
-                  <a:graphicFrameLocks xmlns:a="http://schemas.openxmlformats.org/drawingml/2006/main" noChangeAspect="1"/>
-                </wp:cNvGraphicFramePr>
-                <a:graphic xmlns:a="http://schemas.openxmlformats.org/drawingml/2006/main">
-                  <a:graphicData uri="http://schemas.openxmlformats.org/drawingml/2006/picture">
-                    <pic:pic xmlns:pic="http://schemas.openxmlformats.org/drawingml/2006/picture">
-                      <pic:nvPicPr>
-                        <pic:cNvPr id="102825216" name=""/>
-                        <pic:cNvPicPr>
-                          <a:picLocks noChangeAspect="1"/>
-                        </pic:cNvPicPr>
-                        <pic:nvPr/>
-                      </pic:nvPicPr>
-                      <pic:blipFill rotWithShape="1">
-                        <a:blip r:embed="rId13"/>
-                        <a:stretch/>
-                      </pic:blipFill>
-                      <pic:spPr bwMode="auto">
-                        <a:xfrm>
-                          <a:off x="0" y="0"/>
-                          <a:ext cx="5943599" cy="3368932"/>
-                        </a:xfrm>
-                        <a:prstGeom prst="rect">
-                          <a:avLst/>
-                        </a:prstGeom>
-                      </pic:spPr>
-                    </pic:pic>
-                  </a:graphicData>
-                </a:graphic>
-              </wp:inline>
-            </w:drawing>
-          </mc:Choice>
-          <mc:Fallback>
-            <w:pict>
-              <v:shapetype id="_x0000_t75" coordsize="21600,21600" o:spt="75" o:preferrelative="t" path="m@4@5l@4@11@9@11@9@5xe" filled="f" stroked="f">
-                <v:stroke joinstyle="miter"/>
-                <v:formulas>
-                  <v:f eqn="if lineDrawn pixelLineWidth 0"/>
-                  <v:f eqn="sum @0 1 0"/>
-                  <v:f eqn="sum 0 0 @1"/>
-                  <v:f eqn="prod @2 1 2"/>
-                  <v:f eqn="prod @3 21600 pixelWidth"/>
-                  <v:f eqn="prod @3 21600 pixelHeight"/>
-                  <v:f eqn="sum @0 0 1"/>
-                  <v:f eqn="prod @6 1 2"/>
-                  <v:f eqn="prod @7 21600 pixelWidth"/>
-                  <v:f eqn="sum @8 21600 0"/>
-                  <v:f eqn="prod @7 21600 pixelHeight"/>
-                  <v:f eqn="sum @10 21600 0"/>
-                </v:formulas>
-                <v:path o:extrusionok="f" gradientshapeok="t" o:connecttype="rect"/>
-                <o:lock v:ext="edit" aspectratio="t"/>
-              </v:shapetype>
-              <v:shape id="_x0000_i4" o:spid="_x0000_s4" type="#_x0000_t75" style="width:468.00pt;height:265.27pt;mso-wrap-distance-left:0.00pt;mso-wrap-distance-top:0.00pt;mso-wrap-distance-right:0.00pt;mso-wrap-distance-bottom:0.00pt;z-index:1;" stroked="false">
-                <v:imagedata r:id="rId13" o:title=""/>
-                <o:lock v:ext="edit" rotation="t"/>
-              </v:shape>
-            </w:pict>
-          </mc:Fallback>
-        </mc:AlternateContent>
-      </w:r>
-      <w:r>
-        <w:rPr>
-          <w:highlight w:val="none"/>
-        </w:rPr>
-      </w:r>
-      <w:r>
-        <w:rPr>
-          <w:highlight w:val="none"/>
-        </w:rPr>
-      </w:r>
-    </w:p>
-    <w:p>
-      <w:pPr>
-        <w:pBdr/>
-        <w:spacing/>
-        <w:ind w:firstLine="0" w:left="0"/>
-        <w:rPr>
-          <w:highlight w:val="none"/>
-        </w:rPr>
-      </w:pPr>
-      <w:r>
-        <w:rPr>
-          <w:highlight w:val="none"/>
-        </w:rPr>
-      </w:r>
-      <w:r>
         <w:rPr>
           <w:highlight w:val="none"/>
         </w:rPr>
@@ -1061,7 +1623,7 @@
     </w:p>
     <w:tbl>
       <w:tblPr>
-        <w:tblStyle w:val="705"/>
+        <w:tblStyle w:val="711"/>
         <w:tblW w:w="0" w:type="auto"/>
         <w:tblBorders/>
         <w:tblLook w:val="04A0" w:firstRow="1" w:lastRow="0" w:firstColumn="1" w:lastColumn="0" w:noHBand="0" w:noVBand="1"/>
@@ -1342,7 +1904,7 @@
               <wp:inline xmlns:wp="http://schemas.openxmlformats.org/drawingml/2006/wordprocessingDrawing" distT="0" distB="0" distL="0" distR="0">
                 <wp:extent cx="5943600" cy="3717499"/>
                 <wp:effectExtent l="0" t="0" r="0" b="0"/>
-                <wp:docPr id="6" name=""/>
+                <wp:docPr id="5" name=""/>
                 <wp:cNvGraphicFramePr>
                   <a:graphicFrameLocks xmlns:a="http://schemas.openxmlformats.org/drawingml/2006/main" noChangeAspect="1"/>
                 </wp:cNvGraphicFramePr>
@@ -1357,7 +1919,7 @@
                         <pic:nvPr/>
                       </pic:nvPicPr>
                       <pic:blipFill rotWithShape="1">
-                        <a:blip r:embed="rId14"/>
+                        <a:blip r:embed="rId13"/>
                         <a:stretch/>
                       </pic:blipFill>
                       <pic:spPr bwMode="auto">
@@ -1396,8 +1958,8 @@
                 <v:path o:extrusionok="f" gradientshapeok="t" o:connecttype="rect"/>
                 <o:lock v:ext="edit" aspectratio="t"/>
               </v:shapetype>
-              <v:shape id="_x0000_i5" o:spid="_x0000_s5" type="#_x0000_t75" style="width:468.00pt;height:292.72pt;mso-wrap-distance-left:0.00pt;mso-wrap-distance-top:0.00pt;mso-wrap-distance-right:0.00pt;mso-wrap-distance-bottom:0.00pt;z-index:1;" stroked="false">
-                <v:imagedata r:id="rId14" o:title=""/>
+              <v:shape id="_x0000_i4" o:spid="_x0000_s4" type="#_x0000_t75" style="width:468.00pt;height:292.72pt;mso-wrap-distance-left:0.00pt;mso-wrap-distance-top:0.00pt;mso-wrap-distance-right:0.00pt;mso-wrap-distance-bottom:0.00pt;z-index:1;" stroked="false">
+                <v:imagedata r:id="rId13" o:title=""/>
                 <o:lock v:ext="edit" rotation="t"/>
               </v:shape>
             </w:pict>
@@ -1569,7 +2131,7 @@
               <wp:inline xmlns:wp="http://schemas.openxmlformats.org/drawingml/2006/wordprocessingDrawing" distT="0" distB="0" distL="0" distR="0">
                 <wp:extent cx="5943600" cy="2765619"/>
                 <wp:effectExtent l="0" t="0" r="0" b="0"/>
-                <wp:docPr id="7" name=""/>
+                <wp:docPr id="6" name=""/>
                 <wp:cNvGraphicFramePr>
                   <a:graphicFrameLocks xmlns:a="http://schemas.openxmlformats.org/drawingml/2006/main" noChangeAspect="1"/>
                 </wp:cNvGraphicFramePr>
@@ -1584,7 +2146,7 @@
                         <pic:nvPr/>
                       </pic:nvPicPr>
                       <pic:blipFill rotWithShape="1">
-                        <a:blip r:embed="rId15"/>
+                        <a:blip r:embed="rId14"/>
                         <a:stretch/>
                       </pic:blipFill>
                       <pic:spPr bwMode="auto">
@@ -1623,8 +2185,8 @@
                 <v:path o:extrusionok="f" gradientshapeok="t" o:connecttype="rect"/>
                 <o:lock v:ext="edit" aspectratio="t"/>
               </v:shapetype>
-              <v:shape id="_x0000_i6" o:spid="_x0000_s6" type="#_x0000_t75" style="width:468.00pt;height:217.77pt;mso-wrap-distance-left:0.00pt;mso-wrap-distance-top:0.00pt;mso-wrap-distance-right:0.00pt;mso-wrap-distance-bottom:0.00pt;z-index:1;" stroked="false">
-                <v:imagedata r:id="rId15" o:title=""/>
+              <v:shape id="_x0000_i5" o:spid="_x0000_s5" type="#_x0000_t75" style="width:468.00pt;height:217.77pt;mso-wrap-distance-left:0.00pt;mso-wrap-distance-top:0.00pt;mso-wrap-distance-right:0.00pt;mso-wrap-distance-bottom:0.00pt;z-index:1;" stroked="false">
+                <v:imagedata r:id="rId14" o:title=""/>
                 <o:lock v:ext="edit" rotation="t"/>
               </v:shape>
             </w:pict>
@@ -1669,7 +2231,7 @@
     </w:p>
     <w:p>
       <w:pPr>
-        <w:pStyle w:val="831"/>
+        <w:pStyle w:val="837"/>
         <w:pBdr>
           <w:top w:val="none" w:color="000000" w:sz="4" w:space="0"/>
           <w:left w:val="none" w:color="000000" w:sz="4" w:space="0"/>
@@ -1989,11 +2551,18 @@
           <w:sz w:val="24"/>
         </w:rPr>
       </w:r>
-      <w:r/>
+      <w:r>
+        <w:rPr>
+          <w:rFonts w:ascii="Times New Roman" w:hAnsi="Times New Roman" w:eastAsia="Times New Roman" w:cs="Times New Roman"/>
+          <w:sz w:val="24"/>
+          <w:szCs w:val="24"/>
+          <w:highlight w:val="none"/>
+        </w:rPr>
+      </w:r>
     </w:p>
     <w:p>
       <w:pPr>
-        <w:pStyle w:val="831"/>
+        <w:pStyle w:val="837"/>
         <w:pBdr>
           <w:top w:val="none" w:color="000000" w:sz="4" w:space="0"/>
           <w:left w:val="none" w:color="000000" w:sz="4" w:space="0"/>
@@ -2039,7 +2608,7 @@
     </w:p>
     <w:p>
       <w:pPr>
-        <w:pStyle w:val="832"/>
+        <w:pStyle w:val="838"/>
         <w:pBdr>
           <w:top w:val="none" w:color="000000" w:sz="4" w:space="0"/>
           <w:left w:val="none" w:color="000000" w:sz="4" w:space="0"/>
@@ -2135,7 +2704,7 @@
     </w:p>
     <w:p>
       <w:pPr>
-        <w:pStyle w:val="894"/>
+        <w:pStyle w:val="900"/>
         <w:numPr>
           <w:ilvl w:val="0"/>
           <w:numId w:val="3"/>
@@ -2162,7 +2731,7 @@
     </w:p>
     <w:p>
       <w:pPr>
-        <w:pStyle w:val="894"/>
+        <w:pStyle w:val="900"/>
         <w:numPr>
           <w:ilvl w:val="0"/>
           <w:numId w:val="3"/>
@@ -2189,7 +2758,7 @@
     </w:p>
     <w:p>
       <w:pPr>
-        <w:pStyle w:val="894"/>
+        <w:pStyle w:val="900"/>
         <w:numPr>
           <w:ilvl w:val="0"/>
           <w:numId w:val="3"/>
@@ -2299,7 +2868,7 @@
     </w:p>
     <w:p>
       <w:pPr>
-        <w:pStyle w:val="832"/>
+        <w:pStyle w:val="838"/>
         <w:pBdr>
           <w:top w:val="none" w:color="000000" w:sz="4" w:space="0"/>
           <w:left w:val="none" w:color="000000" w:sz="4" w:space="0"/>
@@ -2417,7 +2986,7 @@
     </w:p>
     <w:p>
       <w:pPr>
-        <w:pStyle w:val="832"/>
+        <w:pStyle w:val="838"/>
         <w:pBdr>
           <w:top w:val="none" w:color="000000" w:sz="4" w:space="0"/>
           <w:left w:val="none" w:color="000000" w:sz="4" w:space="0"/>
@@ -2525,7 +3094,7 @@
     </w:p>
     <w:p>
       <w:pPr>
-        <w:pStyle w:val="894"/>
+        <w:pStyle w:val="900"/>
         <w:numPr>
           <w:ilvl w:val="0"/>
           <w:numId w:val="3"/>
@@ -2552,7 +3121,7 @@
     </w:p>
     <w:p>
       <w:pPr>
-        <w:pStyle w:val="894"/>
+        <w:pStyle w:val="900"/>
         <w:numPr>
           <w:ilvl w:val="0"/>
           <w:numId w:val="3"/>
@@ -2579,7 +3148,7 @@
     </w:p>
     <w:p>
       <w:pPr>
-        <w:pStyle w:val="894"/>
+        <w:pStyle w:val="900"/>
         <w:numPr>
           <w:ilvl w:val="0"/>
           <w:numId w:val="3"/>
@@ -2606,7 +3175,7 @@
     </w:p>
     <w:p>
       <w:pPr>
-        <w:pStyle w:val="894"/>
+        <w:pStyle w:val="900"/>
         <w:numPr>
           <w:ilvl w:val="0"/>
           <w:numId w:val="3"/>
@@ -2645,7 +3214,6 @@
       </w:pPr>
       <w:r/>
       <w:r/>
-      <w:r/>
     </w:p>
     <w:p>
       <w:pPr>
@@ -2672,11 +3240,18 @@
         </w:rPr>
         <w:t xml:space="preserve">##############################################################################</w:t>
       </w:r>
-      <w:r/>
+      <w:r>
+        <w:rPr>
+          <w:rFonts w:ascii="Times New Roman" w:hAnsi="Times New Roman" w:eastAsia="Times New Roman" w:cs="Times New Roman"/>
+          <w:sz w:val="24"/>
+          <w:szCs w:val="24"/>
+          <w:highlight w:val="none"/>
+        </w:rPr>
+      </w:r>
     </w:p>
     <w:p>
       <w:pPr>
-        <w:pStyle w:val="831"/>
+        <w:pStyle w:val="837"/>
         <w:pBdr>
           <w:top w:val="none" w:color="000000" w:sz="4" w:space="0"/>
           <w:left w:val="none" w:color="000000" w:sz="4" w:space="0"/>
@@ -2747,7 +3322,7 @@
     </w:p>
     <w:p>
       <w:pPr>
-        <w:pStyle w:val="831"/>
+        <w:pStyle w:val="837"/>
         <w:pBdr>
           <w:top w:val="none" w:color="000000" w:sz="4" w:space="0"/>
           <w:left w:val="none" w:color="000000" w:sz="4" w:space="0"/>
@@ -2818,7 +3393,7 @@
     </w:p>
     <w:p>
       <w:pPr>
-        <w:pStyle w:val="894"/>
+        <w:pStyle w:val="900"/>
         <w:numPr>
           <w:ilvl w:val="0"/>
           <w:numId w:val="4"/>
@@ -2845,7 +3420,7 @@
     </w:p>
     <w:p>
       <w:pPr>
-        <w:pStyle w:val="894"/>
+        <w:pStyle w:val="900"/>
         <w:numPr>
           <w:ilvl w:val="0"/>
           <w:numId w:val="4"/>
@@ -2872,7 +3447,7 @@
     </w:p>
     <w:p>
       <w:pPr>
-        <w:pStyle w:val="894"/>
+        <w:pStyle w:val="900"/>
         <w:numPr>
           <w:ilvl w:val="0"/>
           <w:numId w:val="4"/>
@@ -2899,7 +3474,7 @@
     </w:p>
     <w:p>
       <w:pPr>
-        <w:pStyle w:val="894"/>
+        <w:pStyle w:val="900"/>
         <w:numPr>
           <w:ilvl w:val="0"/>
           <w:numId w:val="4"/>
@@ -2926,7 +3501,7 @@
     </w:p>
     <w:p>
       <w:pPr>
-        <w:pStyle w:val="831"/>
+        <w:pStyle w:val="837"/>
         <w:pBdr>
           <w:top w:val="none" w:color="000000" w:sz="4" w:space="0"/>
           <w:left w:val="none" w:color="000000" w:sz="4" w:space="0"/>
@@ -2952,6 +3527,7 @@
           <w:sz w:val="48"/>
         </w:rPr>
       </w:r>
+      <w:r/>
     </w:p>
     <w:p>
       <w:pPr>
@@ -2968,7 +3544,6 @@
           <w:sz w:val="48"/>
         </w:rPr>
       </w:r>
-      <w:r/>
       <w:r/>
     </w:p>
     <w:p>
@@ -2995,7 +3570,7 @@
     </w:p>
     <w:p>
       <w:pPr>
-        <w:pStyle w:val="894"/>
+        <w:pStyle w:val="900"/>
         <w:numPr>
           <w:ilvl w:val="0"/>
           <w:numId w:val="5"/>
@@ -3022,7 +3597,7 @@
     </w:p>
     <w:p>
       <w:pPr>
-        <w:pStyle w:val="894"/>
+        <w:pStyle w:val="900"/>
         <w:numPr>
           <w:ilvl w:val="0"/>
           <w:numId w:val="5"/>
@@ -3049,7 +3624,7 @@
     </w:p>
     <w:p>
       <w:pPr>
-        <w:pStyle w:val="894"/>
+        <w:pStyle w:val="900"/>
         <w:numPr>
           <w:ilvl w:val="0"/>
           <w:numId w:val="5"/>
@@ -3076,7 +3651,7 @@
     </w:p>
     <w:p>
       <w:pPr>
-        <w:pStyle w:val="894"/>
+        <w:pStyle w:val="900"/>
         <w:numPr>
           <w:ilvl w:val="0"/>
           <w:numId w:val="5"/>
@@ -3125,7 +3700,7 @@
     </w:p>
     <w:p>
       <w:pPr>
-        <w:pStyle w:val="831"/>
+        <w:pStyle w:val="837"/>
         <w:pBdr>
           <w:top w:val="none" w:color="000000" w:sz="4" w:space="0"/>
           <w:left w:val="none" w:color="000000" w:sz="4" w:space="0"/>
@@ -3149,7 +3724,7 @@
     </w:p>
     <w:tbl>
       <w:tblPr>
-        <w:tblStyle w:val="705"/>
+        <w:tblStyle w:val="711"/>
         <w:tblInd w:w="0" w:type="dxa"/>
         <w:tblW w:w="0" w:type="auto"/>
         <w:tblBorders>
@@ -3185,7 +3760,7 @@
           <w:p>
             <w:pPr>
               <w:pBdr/>
-              <w:spacing w:after="0" w:before="0" w:line="240"/>
+              <w:spacing w:after="0" w:before="0" w:line="240" w:lineRule="auto"/>
               <w:ind/>
               <w:jc w:val="center"/>
               <w:rPr/>
@@ -3217,7 +3792,7 @@
           <w:p>
             <w:pPr>
               <w:pBdr/>
-              <w:spacing w:after="0" w:before="0" w:line="240"/>
+              <w:spacing w:after="0" w:before="0" w:line="240" w:lineRule="auto"/>
               <w:ind/>
               <w:jc w:val="center"/>
               <w:rPr/>
@@ -3249,7 +3824,7 @@
           <w:p>
             <w:pPr>
               <w:pBdr/>
-              <w:spacing w:after="0" w:before="0" w:line="240"/>
+              <w:spacing w:after="0" w:before="0" w:line="240" w:lineRule="auto"/>
               <w:ind/>
               <w:jc w:val="center"/>
               <w:rPr/>
@@ -3284,7 +3859,7 @@
           <w:p>
             <w:pPr>
               <w:pBdr/>
-              <w:spacing w:after="0" w:before="0" w:line="240"/>
+              <w:spacing w:after="0" w:before="0" w:line="240" w:lineRule="auto"/>
               <w:ind/>
               <w:rPr/>
             </w:pPr>
@@ -3314,7 +3889,7 @@
           <w:p>
             <w:pPr>
               <w:pBdr/>
-              <w:spacing w:after="0" w:before="0" w:line="240"/>
+              <w:spacing w:after="0" w:before="0" w:line="240" w:lineRule="auto"/>
               <w:ind/>
               <w:rPr/>
             </w:pPr>
@@ -3344,7 +3919,7 @@
           <w:p>
             <w:pPr>
               <w:pBdr/>
-              <w:spacing w:after="0" w:before="0" w:line="240"/>
+              <w:spacing w:after="0" w:before="0" w:line="240" w:lineRule="auto"/>
               <w:ind/>
               <w:rPr/>
             </w:pPr>
@@ -3377,7 +3952,7 @@
           <w:p>
             <w:pPr>
               <w:pBdr/>
-              <w:spacing w:after="0" w:before="0" w:line="240"/>
+              <w:spacing w:after="0" w:before="0" w:line="240" w:lineRule="auto"/>
               <w:ind/>
               <w:rPr/>
             </w:pPr>
@@ -3407,7 +3982,7 @@
           <w:p>
             <w:pPr>
               <w:pBdr/>
-              <w:spacing w:after="0" w:before="0" w:line="240"/>
+              <w:spacing w:after="0" w:before="0" w:line="240" w:lineRule="auto"/>
               <w:ind/>
               <w:rPr/>
             </w:pPr>
@@ -3437,7 +4012,7 @@
           <w:p>
             <w:pPr>
               <w:pBdr/>
-              <w:spacing w:after="0" w:before="0" w:line="240"/>
+              <w:spacing w:after="0" w:before="0" w:line="240" w:lineRule="auto"/>
               <w:ind/>
               <w:rPr/>
             </w:pPr>
@@ -3470,7 +4045,7 @@
           <w:p>
             <w:pPr>
               <w:pBdr/>
-              <w:spacing w:after="0" w:before="0" w:line="240"/>
+              <w:spacing w:after="0" w:before="0" w:line="240" w:lineRule="auto"/>
               <w:ind/>
               <w:rPr/>
             </w:pPr>
@@ -3500,7 +4075,7 @@
           <w:p>
             <w:pPr>
               <w:pBdr/>
-              <w:spacing w:after="0" w:before="0" w:line="240"/>
+              <w:spacing w:after="0" w:before="0" w:line="240" w:lineRule="auto"/>
               <w:ind/>
               <w:rPr/>
             </w:pPr>
@@ -3530,7 +4105,7 @@
           <w:p>
             <w:pPr>
               <w:pBdr/>
-              <w:spacing w:after="0" w:before="0" w:line="240"/>
+              <w:spacing w:after="0" w:before="0" w:line="240" w:lineRule="auto"/>
               <w:ind/>
               <w:rPr/>
             </w:pPr>
@@ -3563,7 +4138,7 @@
           <w:p>
             <w:pPr>
               <w:pBdr/>
-              <w:spacing w:after="0" w:before="0" w:line="240"/>
+              <w:spacing w:after="0" w:before="0" w:line="240" w:lineRule="auto"/>
               <w:ind/>
               <w:rPr/>
             </w:pPr>
@@ -3593,7 +4168,7 @@
           <w:p>
             <w:pPr>
               <w:pBdr/>
-              <w:spacing w:after="0" w:before="0" w:line="240"/>
+              <w:spacing w:after="0" w:before="0" w:line="240" w:lineRule="auto"/>
               <w:ind/>
               <w:rPr/>
             </w:pPr>
@@ -3623,7 +4198,7 @@
           <w:p>
             <w:pPr>
               <w:pBdr/>
-              <w:spacing w:after="0" w:before="0" w:line="240"/>
+              <w:spacing w:after="0" w:before="0" w:line="240" w:lineRule="auto"/>
               <w:ind/>
               <w:rPr/>
             </w:pPr>
@@ -3656,7 +4231,7 @@
           <w:p>
             <w:pPr>
               <w:pBdr/>
-              <w:spacing w:after="0" w:before="0" w:line="240"/>
+              <w:spacing w:after="0" w:before="0" w:line="240" w:lineRule="auto"/>
               <w:ind/>
               <w:rPr/>
             </w:pPr>
@@ -3686,7 +4261,7 @@
           <w:p>
             <w:pPr>
               <w:pBdr/>
-              <w:spacing w:after="0" w:before="0" w:line="240"/>
+              <w:spacing w:after="0" w:before="0" w:line="240" w:lineRule="auto"/>
               <w:ind/>
               <w:rPr/>
             </w:pPr>
@@ -3716,7 +4291,7 @@
           <w:p>
             <w:pPr>
               <w:pBdr/>
-              <w:spacing w:after="0" w:before="0" w:line="240"/>
+              <w:spacing w:after="0" w:before="0" w:line="240" w:lineRule="auto"/>
               <w:ind/>
               <w:rPr/>
             </w:pPr>
@@ -3749,7 +4324,7 @@
           <w:p>
             <w:pPr>
               <w:pBdr/>
-              <w:spacing w:after="0" w:before="0" w:line="240"/>
+              <w:spacing w:after="0" w:before="0" w:line="240" w:lineRule="auto"/>
               <w:ind/>
               <w:rPr/>
             </w:pPr>
@@ -3779,7 +4354,7 @@
           <w:p>
             <w:pPr>
               <w:pBdr/>
-              <w:spacing w:after="0" w:before="0" w:line="240"/>
+              <w:spacing w:after="0" w:before="0" w:line="240" w:lineRule="auto"/>
               <w:ind/>
               <w:rPr/>
             </w:pPr>
@@ -3809,7 +4384,7 @@
           <w:p>
             <w:pPr>
               <w:pBdr/>
-              <w:spacing w:after="0" w:before="0" w:line="240"/>
+              <w:spacing w:after="0" w:before="0" w:line="240" w:lineRule="auto"/>
               <w:ind/>
               <w:rPr/>
             </w:pPr>
@@ -3842,7 +4417,7 @@
           <w:p>
             <w:pPr>
               <w:pBdr/>
-              <w:spacing w:after="0" w:before="0" w:line="240"/>
+              <w:spacing w:after="0" w:before="0" w:line="240" w:lineRule="auto"/>
               <w:ind/>
               <w:rPr/>
             </w:pPr>
@@ -3872,7 +4447,7 @@
           <w:p>
             <w:pPr>
               <w:pBdr/>
-              <w:spacing w:after="0" w:before="0" w:line="240"/>
+              <w:spacing w:after="0" w:before="0" w:line="240" w:lineRule="auto"/>
               <w:ind/>
               <w:rPr/>
             </w:pPr>
@@ -3902,7 +4477,7 @@
           <w:p>
             <w:pPr>
               <w:pBdr/>
-              <w:spacing w:after="0" w:before="0" w:line="240"/>
+              <w:spacing w:after="0" w:before="0" w:line="240" w:lineRule="auto"/>
               <w:ind/>
               <w:rPr/>
             </w:pPr>
@@ -3935,7 +4510,7 @@
           <w:p>
             <w:pPr>
               <w:pBdr/>
-              <w:spacing w:after="0" w:before="0" w:line="240"/>
+              <w:spacing w:after="0" w:before="0" w:line="240" w:lineRule="auto"/>
               <w:ind/>
               <w:rPr/>
             </w:pPr>
@@ -3965,7 +4540,7 @@
           <w:p>
             <w:pPr>
               <w:pBdr/>
-              <w:spacing w:after="0" w:before="0" w:line="240"/>
+              <w:spacing w:after="0" w:before="0" w:line="240" w:lineRule="auto"/>
               <w:ind/>
               <w:rPr/>
             </w:pPr>
@@ -3995,7 +4570,7 @@
           <w:p>
             <w:pPr>
               <w:pBdr/>
-              <w:spacing w:after="0" w:before="0" w:line="240"/>
+              <w:spacing w:after="0" w:before="0" w:line="240" w:lineRule="auto"/>
               <w:ind/>
               <w:rPr/>
             </w:pPr>
@@ -4028,7 +4603,7 @@
           <w:p>
             <w:pPr>
               <w:pBdr/>
-              <w:spacing w:after="0" w:before="0" w:line="240"/>
+              <w:spacing w:after="0" w:before="0" w:line="240" w:lineRule="auto"/>
               <w:ind/>
               <w:rPr/>
             </w:pPr>
@@ -4058,7 +4633,7 @@
           <w:p>
             <w:pPr>
               <w:pBdr/>
-              <w:spacing w:after="0" w:before="0" w:line="240"/>
+              <w:spacing w:after="0" w:before="0" w:line="240" w:lineRule="auto"/>
               <w:ind/>
               <w:rPr/>
             </w:pPr>
@@ -4088,7 +4663,7 @@
           <w:p>
             <w:pPr>
               <w:pBdr/>
-              <w:spacing w:after="0" w:before="0" w:line="240"/>
+              <w:spacing w:after="0" w:before="0" w:line="240" w:lineRule="auto"/>
               <w:ind/>
               <w:rPr/>
             </w:pPr>
@@ -4131,13 +4706,7 @@
           <w:highlight w:val="none"/>
         </w:rPr>
       </w:r>
-      <w:r>
-        <w:rPr>
-          <w:rFonts w:ascii="Times New Roman" w:hAnsi="Times New Roman" w:eastAsia="Times New Roman" w:cs="Times New Roman"/>
-          <w:sz w:val="24"/>
-          <w:highlight w:val="none"/>
-        </w:rPr>
-      </w:r>
+      <w:r/>
     </w:p>
     <w:sectPr>
       <w:footnotePr/>
@@ -5094,9 +5663,9 @@
     <w:lsdException w:name="Bibliography" w:uiPriority="37"/>
     <w:lsdException w:name="TOC Heading" w:uiPriority="39" w:qFormat="1"/>
   </w:latentStyles>
-  <w:style w:type="table" w:styleId="705">
+  <w:style w:type="table" w:styleId="711">
     <w:name w:val="Table Grid"/>
-    <w:basedOn w:val="891"/>
+    <w:basedOn w:val="897"/>
     <w:uiPriority w:val="59"/>
     <w:pPr>
       <w:pBdr/>
@@ -5293,9 +5862,9 @@
       </w:tcPr>
     </w:tblStylePr>
   </w:style>
-  <w:style w:type="table" w:styleId="706">
+  <w:style w:type="table" w:styleId="712">
     <w:name w:val="Table Grid Light"/>
-    <w:basedOn w:val="891"/>
+    <w:basedOn w:val="897"/>
     <w:uiPriority w:val="59"/>
     <w:pPr>
       <w:pBdr/>
@@ -5492,9 +6061,9 @@
       </w:tcPr>
     </w:tblStylePr>
   </w:style>
-  <w:style w:type="table" w:styleId="707">
+  <w:style w:type="table" w:styleId="713">
     <w:name w:val="Plain Table 1"/>
-    <w:basedOn w:val="891"/>
+    <w:basedOn w:val="897"/>
     <w:uiPriority w:val="59"/>
     <w:pPr>
       <w:pBdr/>
@@ -5717,9 +6286,9 @@
       </w:tcPr>
     </w:tblStylePr>
   </w:style>
-  <w:style w:type="table" w:styleId="708">
+  <w:style w:type="table" w:styleId="714">
     <w:name w:val="Plain Table 2"/>
-    <w:basedOn w:val="891"/>
+    <w:basedOn w:val="897"/>
     <w:uiPriority w:val="59"/>
     <w:pPr>
       <w:pBdr/>
@@ -5950,9 +6519,9 @@
       </w:tcPr>
     </w:tblStylePr>
   </w:style>
-  <w:style w:type="table" w:styleId="709">
+  <w:style w:type="table" w:styleId="715">
     <w:name w:val="Plain Table 3"/>
-    <w:basedOn w:val="891"/>
+    <w:basedOn w:val="897"/>
     <w:uiPriority w:val="99"/>
     <w:pPr>
       <w:pBdr/>
@@ -6180,9 +6749,9 @@
       </w:tcPr>
     </w:tblStylePr>
   </w:style>
-  <w:style w:type="table" w:styleId="710">
+  <w:style w:type="table" w:styleId="716">
     <w:name w:val="Plain Table 4"/>
-    <w:basedOn w:val="891"/>
+    <w:basedOn w:val="897"/>
     <w:uiPriority w:val="99"/>
     <w:pPr>
       <w:pBdr/>
@@ -6396,9 +6965,9 @@
       </w:tcPr>
     </w:tblStylePr>
   </w:style>
-  <w:style w:type="table" w:styleId="711">
+  <w:style w:type="table" w:styleId="717">
     <w:name w:val="Plain Table 5"/>
-    <w:basedOn w:val="891"/>
+    <w:basedOn w:val="897"/>
     <w:uiPriority w:val="99"/>
     <w:pPr>
       <w:pBdr/>
@@ -6629,9 +7198,9 @@
       </w:tcPr>
     </w:tblStylePr>
   </w:style>
-  <w:style w:type="table" w:styleId="712">
+  <w:style w:type="table" w:styleId="718">
     <w:name w:val="Grid Table 1 Light"/>
-    <w:basedOn w:val="891"/>
+    <w:basedOn w:val="897"/>
     <w:uiPriority w:val="99"/>
     <w:pPr>
       <w:pBdr/>
@@ -6852,9 +7421,9 @@
       </w:tcPr>
     </w:tblStylePr>
   </w:style>
-  <w:style w:type="table" w:styleId="713">
+  <w:style w:type="table" w:styleId="719">
     <w:name w:val="Grid Table 1 Light - Accent 1"/>
-    <w:basedOn w:val="891"/>
+    <w:basedOn w:val="897"/>
     <w:uiPriority w:val="99"/>
     <w:pPr>
       <w:pBdr/>
@@ -7075,9 +7644,9 @@
       </w:tcPr>
     </w:tblStylePr>
   </w:style>
-  <w:style w:type="table" w:styleId="714">
+  <w:style w:type="table" w:styleId="720">
     <w:name w:val="Grid Table 1 Light - Accent 2"/>
-    <w:basedOn w:val="891"/>
+    <w:basedOn w:val="897"/>
     <w:uiPriority w:val="99"/>
     <w:pPr>
       <w:pBdr/>
@@ -7298,9 +7867,9 @@
       </w:tcPr>
     </w:tblStylePr>
   </w:style>
-  <w:style w:type="table" w:styleId="715">
+  <w:style w:type="table" w:styleId="721">
     <w:name w:val="Grid Table 1 Light - Accent 3"/>
-    <w:basedOn w:val="891"/>
+    <w:basedOn w:val="897"/>
     <w:uiPriority w:val="99"/>
     <w:pPr>
       <w:pBdr/>
@@ -7521,9 +8090,9 @@
       </w:tcPr>
     </w:tblStylePr>
   </w:style>
-  <w:style w:type="table" w:styleId="716">
+  <w:style w:type="table" w:styleId="722">
     <w:name w:val="Grid Table 1 Light - Accent 4"/>
-    <w:basedOn w:val="891"/>
+    <w:basedOn w:val="897"/>
     <w:uiPriority w:val="99"/>
     <w:pPr>
       <w:pBdr/>
@@ -7744,9 +8313,9 @@
       </w:tcPr>
     </w:tblStylePr>
   </w:style>
-  <w:style w:type="table" w:styleId="717">
+  <w:style w:type="table" w:styleId="723">
     <w:name w:val="Grid Table 1 Light - Accent 5"/>
-    <w:basedOn w:val="891"/>
+    <w:basedOn w:val="897"/>
     <w:uiPriority w:val="99"/>
     <w:pPr>
       <w:pBdr/>
@@ -7967,9 +8536,9 @@
       </w:tcPr>
     </w:tblStylePr>
   </w:style>
-  <w:style w:type="table" w:styleId="718">
+  <w:style w:type="table" w:styleId="724">
     <w:name w:val="Grid Table 1 Light - Accent 6"/>
-    <w:basedOn w:val="891"/>
+    <w:basedOn w:val="897"/>
     <w:uiPriority w:val="99"/>
     <w:pPr>
       <w:pBdr/>
@@ -8190,9 +8759,9 @@
       </w:tcPr>
     </w:tblStylePr>
   </w:style>
-  <w:style w:type="table" w:styleId="719">
+  <w:style w:type="table" w:styleId="725">
     <w:name w:val="Grid Table 2"/>
-    <w:basedOn w:val="891"/>
+    <w:basedOn w:val="897"/>
     <w:uiPriority w:val="99"/>
     <w:pPr>
       <w:pBdr/>
@@ -8422,9 +8991,9 @@
       </w:tcPr>
     </w:tblStylePr>
   </w:style>
-  <w:style w:type="table" w:styleId="720">
+  <w:style w:type="table" w:styleId="726">
     <w:name w:val="Grid Table 2 - Accent 1"/>
-    <w:basedOn w:val="891"/>
+    <w:basedOn w:val="897"/>
     <w:uiPriority w:val="99"/>
     <w:pPr>
       <w:pBdr/>
@@ -8654,9 +9223,9 @@
       </w:tcPr>
     </w:tblStylePr>
   </w:style>
-  <w:style w:type="table" w:styleId="721">
+  <w:style w:type="table" w:styleId="727">
     <w:name w:val="Grid Table 2 - Accent 2"/>
-    <w:basedOn w:val="891"/>
+    <w:basedOn w:val="897"/>
     <w:uiPriority w:val="99"/>
     <w:pPr>
       <w:pBdr/>
@@ -8886,9 +9455,9 @@
       </w:tcPr>
     </w:tblStylePr>
   </w:style>
-  <w:style w:type="table" w:styleId="722">
+  <w:style w:type="table" w:styleId="728">
     <w:name w:val="Grid Table 2 - Accent 3"/>
-    <w:basedOn w:val="891"/>
+    <w:basedOn w:val="897"/>
     <w:uiPriority w:val="99"/>
     <w:pPr>
       <w:pBdr/>
@@ -9118,9 +9687,9 @@
       </w:tcPr>
     </w:tblStylePr>
   </w:style>
-  <w:style w:type="table" w:styleId="723">
+  <w:style w:type="table" w:styleId="729">
     <w:name w:val="Grid Table 2 - Accent 4"/>
-    <w:basedOn w:val="891"/>
+    <w:basedOn w:val="897"/>
     <w:uiPriority w:val="99"/>
     <w:pPr>
       <w:pBdr/>
@@ -9350,9 +9919,9 @@
       </w:tcPr>
     </w:tblStylePr>
   </w:style>
-  <w:style w:type="table" w:styleId="724">
+  <w:style w:type="table" w:styleId="730">
     <w:name w:val="Grid Table 2 - Accent 5"/>
-    <w:basedOn w:val="891"/>
+    <w:basedOn w:val="897"/>
     <w:uiPriority w:val="99"/>
     <w:pPr>
       <w:pBdr/>
@@ -9582,9 +10151,9 @@
       </w:tcPr>
     </w:tblStylePr>
   </w:style>
-  <w:style w:type="table" w:styleId="725">
+  <w:style w:type="table" w:styleId="731">
     <w:name w:val="Grid Table 2 - Accent 6"/>
-    <w:basedOn w:val="891"/>
+    <w:basedOn w:val="897"/>
     <w:uiPriority w:val="99"/>
     <w:pPr>
       <w:pBdr/>
@@ -9814,9 +10383,9 @@
       </w:tcPr>
     </w:tblStylePr>
   </w:style>
-  <w:style w:type="table" w:styleId="726">
+  <w:style w:type="table" w:styleId="732">
     <w:name w:val="Grid Table 3"/>
-    <w:basedOn w:val="891"/>
+    <w:basedOn w:val="897"/>
     <w:uiPriority w:val="99"/>
     <w:pPr>
       <w:pBdr/>
@@ -10059,9 +10628,9 @@
       </w:tcPr>
     </w:tblStylePr>
   </w:style>
-  <w:style w:type="table" w:styleId="727">
+  <w:style w:type="table" w:styleId="733">
     <w:name w:val="Grid Table 3 - Accent 1"/>
-    <w:basedOn w:val="891"/>
+    <w:basedOn w:val="897"/>
     <w:uiPriority w:val="99"/>
     <w:pPr>
       <w:pBdr/>
@@ -10304,9 +10873,9 @@
       </w:tcPr>
     </w:tblStylePr>
   </w:style>
-  <w:style w:type="table" w:styleId="728">
+  <w:style w:type="table" w:styleId="734">
     <w:name w:val="Grid Table 3 - Accent 2"/>
-    <w:basedOn w:val="891"/>
+    <w:basedOn w:val="897"/>
     <w:uiPriority w:val="99"/>
     <w:pPr>
       <w:pBdr/>
@@ -10549,9 +11118,9 @@
       </w:tcPr>
     </w:tblStylePr>
   </w:style>
-  <w:style w:type="table" w:styleId="729">
+  <w:style w:type="table" w:styleId="735">
     <w:name w:val="Grid Table 3 - Accent 3"/>
-    <w:basedOn w:val="891"/>
+    <w:basedOn w:val="897"/>
     <w:uiPriority w:val="99"/>
     <w:pPr>
       <w:pBdr/>
@@ -10794,9 +11363,9 @@
       </w:tcPr>
     </w:tblStylePr>
   </w:style>
-  <w:style w:type="table" w:styleId="730">
+  <w:style w:type="table" w:styleId="736">
     <w:name w:val="Grid Table 3 - Accent 4"/>
-    <w:basedOn w:val="891"/>
+    <w:basedOn w:val="897"/>
     <w:uiPriority w:val="99"/>
     <w:pPr>
       <w:pBdr/>
@@ -11039,9 +11608,9 @@
       </w:tcPr>
     </w:tblStylePr>
   </w:style>
-  <w:style w:type="table" w:styleId="731">
+  <w:style w:type="table" w:styleId="737">
     <w:name w:val="Grid Table 3 - Accent 5"/>
-    <w:basedOn w:val="891"/>
+    <w:basedOn w:val="897"/>
     <w:uiPriority w:val="99"/>
     <w:pPr>
       <w:pBdr/>
@@ -11284,9 +11853,9 @@
       </w:tcPr>
     </w:tblStylePr>
   </w:style>
-  <w:style w:type="table" w:styleId="732">
+  <w:style w:type="table" w:styleId="738">
     <w:name w:val="Grid Table 3 - Accent 6"/>
-    <w:basedOn w:val="891"/>
+    <w:basedOn w:val="897"/>
     <w:uiPriority w:val="99"/>
     <w:pPr>
       <w:pBdr/>
@@ -11529,9 +12098,9 @@
       </w:tcPr>
     </w:tblStylePr>
   </w:style>
-  <w:style w:type="table" w:styleId="733">
+  <w:style w:type="table" w:styleId="739">
     <w:name w:val="Grid Table 4"/>
-    <w:basedOn w:val="891"/>
+    <w:basedOn w:val="897"/>
     <w:uiPriority w:val="59"/>
     <w:pPr>
       <w:pBdr/>
@@ -11762,9 +12331,9 @@
       </w:tcPr>
     </w:tblStylePr>
   </w:style>
-  <w:style w:type="table" w:styleId="734">
+  <w:style w:type="table" w:styleId="740">
     <w:name w:val="Grid Table 4 - Accent 1"/>
-    <w:basedOn w:val="891"/>
+    <w:basedOn w:val="897"/>
     <w:uiPriority w:val="59"/>
     <w:pPr>
       <w:pBdr/>
@@ -11995,9 +12564,9 @@
       </w:tcPr>
     </w:tblStylePr>
   </w:style>
-  <w:style w:type="table" w:styleId="735">
+  <w:style w:type="table" w:styleId="741">
     <w:name w:val="Grid Table 4 - Accent 2"/>
-    <w:basedOn w:val="891"/>
+    <w:basedOn w:val="897"/>
     <w:uiPriority w:val="59"/>
     <w:pPr>
       <w:pBdr/>
@@ -12228,9 +12797,9 @@
       </w:tcPr>
     </w:tblStylePr>
   </w:style>
-  <w:style w:type="table" w:styleId="736">
+  <w:style w:type="table" w:styleId="742">
     <w:name w:val="Grid Table 4 - Accent 3"/>
-    <w:basedOn w:val="891"/>
+    <w:basedOn w:val="897"/>
     <w:uiPriority w:val="59"/>
     <w:pPr>
       <w:pBdr/>
@@ -12461,9 +13030,9 @@
       </w:tcPr>
     </w:tblStylePr>
   </w:style>
-  <w:style w:type="table" w:styleId="737">
+  <w:style w:type="table" w:styleId="743">
     <w:name w:val="Grid Table 4 - Accent 4"/>
-    <w:basedOn w:val="891"/>
+    <w:basedOn w:val="897"/>
     <w:uiPriority w:val="59"/>
     <w:pPr>
       <w:pBdr/>
@@ -12694,9 +13263,9 @@
       </w:tcPr>
     </w:tblStylePr>
   </w:style>
-  <w:style w:type="table" w:styleId="738">
+  <w:style w:type="table" w:styleId="744">
     <w:name w:val="Grid Table 4 - Accent 5"/>
-    <w:basedOn w:val="891"/>
+    <w:basedOn w:val="897"/>
     <w:uiPriority w:val="59"/>
     <w:pPr>
       <w:pBdr/>
@@ -12927,9 +13496,9 @@
       </w:tcPr>
     </w:tblStylePr>
   </w:style>
-  <w:style w:type="table" w:styleId="739">
+  <w:style w:type="table" w:styleId="745">
     <w:name w:val="Grid Table 4 - Accent 6"/>
-    <w:basedOn w:val="891"/>
+    <w:basedOn w:val="897"/>
     <w:uiPriority w:val="59"/>
     <w:pPr>
       <w:pBdr/>
@@ -13160,9 +13729,9 @@
       </w:tcPr>
     </w:tblStylePr>
   </w:style>
-  <w:style w:type="table" w:styleId="740">
+  <w:style w:type="table" w:styleId="746">
     <w:name w:val="Grid Table 5 Dark"/>
-    <w:basedOn w:val="891"/>
+    <w:basedOn w:val="897"/>
     <w:uiPriority w:val="99"/>
     <w:pPr>
       <w:pBdr/>
@@ -13388,9 +13957,9 @@
       </w:tcPr>
     </w:tblStylePr>
   </w:style>
-  <w:style w:type="table" w:styleId="741">
+  <w:style w:type="table" w:styleId="747">
     <w:name w:val="Grid Table 5 Dark- Accent 1"/>
-    <w:basedOn w:val="891"/>
+    <w:basedOn w:val="897"/>
     <w:uiPriority w:val="99"/>
     <w:pPr>
       <w:pBdr/>
@@ -13616,9 +14185,9 @@
       </w:tcPr>
     </w:tblStylePr>
   </w:style>
-  <w:style w:type="table" w:styleId="742">
+  <w:style w:type="table" w:styleId="748">
     <w:name w:val="Grid Table 5 Dark - Accent 2"/>
-    <w:basedOn w:val="891"/>
+    <w:basedOn w:val="897"/>
     <w:uiPriority w:val="99"/>
     <w:pPr>
       <w:pBdr/>
@@ -13844,9 +14413,9 @@
       </w:tcPr>
     </w:tblStylePr>
   </w:style>
-  <w:style w:type="table" w:styleId="743">
+  <w:style w:type="table" w:styleId="749">
     <w:name w:val="Grid Table 5 Dark - Accent 3"/>
-    <w:basedOn w:val="891"/>
+    <w:basedOn w:val="897"/>
     <w:uiPriority w:val="99"/>
     <w:pPr>
       <w:pBdr/>
@@ -14072,9 +14641,9 @@
       </w:tcPr>
     </w:tblStylePr>
   </w:style>
-  <w:style w:type="table" w:styleId="744">
+  <w:style w:type="table" w:styleId="750">
     <w:name w:val="Grid Table 5 Dark- Accent 4"/>
-    <w:basedOn w:val="891"/>
+    <w:basedOn w:val="897"/>
     <w:uiPriority w:val="99"/>
     <w:pPr>
       <w:pBdr/>
@@ -14300,9 +14869,9 @@
       </w:tcPr>
     </w:tblStylePr>
   </w:style>
-  <w:style w:type="table" w:styleId="745">
+  <w:style w:type="table" w:styleId="751">
     <w:name w:val="Grid Table 5 Dark - Accent 5"/>
-    <w:basedOn w:val="891"/>
+    <w:basedOn w:val="897"/>
     <w:uiPriority w:val="99"/>
     <w:pPr>
       <w:pBdr/>
@@ -14528,9 +15097,9 @@
       </w:tcPr>
     </w:tblStylePr>
   </w:style>
-  <w:style w:type="table" w:styleId="746">
+  <w:style w:type="table" w:styleId="752">
     <w:name w:val="Grid Table 5 Dark - Accent 6"/>
-    <w:basedOn w:val="891"/>
+    <w:basedOn w:val="897"/>
     <w:uiPriority w:val="99"/>
     <w:pPr>
       <w:pBdr/>
@@ -14756,9 +15325,9 @@
       </w:tcPr>
     </w:tblStylePr>
   </w:style>
-  <w:style w:type="table" w:styleId="747">
+  <w:style w:type="table" w:styleId="753">
     <w:name w:val="Grid Table 6 Colorful"/>
-    <w:basedOn w:val="891"/>
+    <w:basedOn w:val="897"/>
     <w:uiPriority w:val="99"/>
     <w:pPr>
       <w:pBdr/>
@@ -14986,9 +15555,9 @@
       </w:tcPr>
     </w:tblStylePr>
   </w:style>
-  <w:style w:type="table" w:styleId="748">
+  <w:style w:type="table" w:styleId="754">
     <w:name w:val="Grid Table 6 Colorful - Accent 1"/>
-    <w:basedOn w:val="891"/>
+    <w:basedOn w:val="897"/>
     <w:uiPriority w:val="99"/>
     <w:pPr>
       <w:pBdr/>
@@ -15216,9 +15785,9 @@
       </w:tcPr>
     </w:tblStylePr>
   </w:style>
-  <w:style w:type="table" w:styleId="749">
+  <w:style w:type="table" w:styleId="755">
     <w:name w:val="Grid Table 6 Colorful - Accent 2"/>
-    <w:basedOn w:val="891"/>
+    <w:basedOn w:val="897"/>
     <w:uiPriority w:val="99"/>
     <w:pPr>
       <w:pBdr/>
@@ -15446,9 +16015,9 @@
       </w:tcPr>
     </w:tblStylePr>
   </w:style>
-  <w:style w:type="table" w:styleId="750">
+  <w:style w:type="table" w:styleId="756">
     <w:name w:val="Grid Table 6 Colorful - Accent 3"/>
-    <w:basedOn w:val="891"/>
+    <w:basedOn w:val="897"/>
     <w:uiPriority w:val="99"/>
     <w:pPr>
       <w:pBdr/>
@@ -15676,9 +16245,9 @@
       </w:tcPr>
     </w:tblStylePr>
   </w:style>
-  <w:style w:type="table" w:styleId="751">
+  <w:style w:type="table" w:styleId="757">
     <w:name w:val="Grid Table 6 Colorful - Accent 4"/>
-    <w:basedOn w:val="891"/>
+    <w:basedOn w:val="897"/>
     <w:uiPriority w:val="99"/>
     <w:pPr>
       <w:pBdr/>
@@ -15906,9 +16475,9 @@
       </w:tcPr>
     </w:tblStylePr>
   </w:style>
-  <w:style w:type="table" w:styleId="752">
+  <w:style w:type="table" w:styleId="758">
     <w:name w:val="Grid Table 6 Colorful - Accent 5"/>
-    <w:basedOn w:val="891"/>
+    <w:basedOn w:val="897"/>
     <w:uiPriority w:val="99"/>
     <w:pPr>
       <w:pBdr/>
@@ -16136,9 +16705,9 @@
       </w:tcPr>
     </w:tblStylePr>
   </w:style>
-  <w:style w:type="table" w:styleId="753">
+  <w:style w:type="table" w:styleId="759">
     <w:name w:val="Grid Table 6 Colorful - Accent 6"/>
-    <w:basedOn w:val="891"/>
+    <w:basedOn w:val="897"/>
     <w:uiPriority w:val="99"/>
     <w:pPr>
       <w:pBdr/>
@@ -16366,9 +16935,9 @@
       </w:tcPr>
     </w:tblStylePr>
   </w:style>
-  <w:style w:type="table" w:styleId="754">
+  <w:style w:type="table" w:styleId="760">
     <w:name w:val="Grid Table 7 Colorful"/>
-    <w:basedOn w:val="891"/>
+    <w:basedOn w:val="897"/>
     <w:uiPriority w:val="99"/>
     <w:pPr>
       <w:pBdr/>
@@ -16620,9 +17189,9 @@
       </w:tcPr>
     </w:tblStylePr>
   </w:style>
-  <w:style w:type="table" w:styleId="755">
+  <w:style w:type="table" w:styleId="761">
     <w:name w:val="Grid Table 7 Colorful - Accent 1"/>
-    <w:basedOn w:val="891"/>
+    <w:basedOn w:val="897"/>
     <w:uiPriority w:val="99"/>
     <w:pPr>
       <w:pBdr/>
@@ -16874,9 +17443,9 @@
       </w:tcPr>
     </w:tblStylePr>
   </w:style>
-  <w:style w:type="table" w:styleId="756">
+  <w:style w:type="table" w:styleId="762">
     <w:name w:val="Grid Table 7 Colorful - Accent 2"/>
-    <w:basedOn w:val="891"/>
+    <w:basedOn w:val="897"/>
     <w:uiPriority w:val="99"/>
     <w:pPr>
       <w:pBdr/>
@@ -17128,9 +17697,9 @@
       </w:tcPr>
     </w:tblStylePr>
   </w:style>
-  <w:style w:type="table" w:styleId="757">
+  <w:style w:type="table" w:styleId="763">
     <w:name w:val="Grid Table 7 Colorful - Accent 3"/>
-    <w:basedOn w:val="891"/>
+    <w:basedOn w:val="897"/>
     <w:uiPriority w:val="99"/>
     <w:pPr>
       <w:pBdr/>
@@ -17382,9 +17951,9 @@
       </w:tcPr>
     </w:tblStylePr>
   </w:style>
-  <w:style w:type="table" w:styleId="758">
+  <w:style w:type="table" w:styleId="764">
     <w:name w:val="Grid Table 7 Colorful - Accent 4"/>
-    <w:basedOn w:val="891"/>
+    <w:basedOn w:val="897"/>
     <w:uiPriority w:val="99"/>
     <w:pPr>
       <w:pBdr/>
@@ -17636,9 +18205,9 @@
       </w:tcPr>
     </w:tblStylePr>
   </w:style>
-  <w:style w:type="table" w:styleId="759">
+  <w:style w:type="table" w:styleId="765">
     <w:name w:val="Grid Table 7 Colorful - Accent 5"/>
-    <w:basedOn w:val="891"/>
+    <w:basedOn w:val="897"/>
     <w:uiPriority w:val="99"/>
     <w:pPr>
       <w:pBdr/>
@@ -17890,9 +18459,9 @@
       </w:tcPr>
     </w:tblStylePr>
   </w:style>
-  <w:style w:type="table" w:styleId="760">
+  <w:style w:type="table" w:styleId="766">
     <w:name w:val="Grid Table 7 Colorful - Accent 6"/>
-    <w:basedOn w:val="891"/>
+    <w:basedOn w:val="897"/>
     <w:uiPriority w:val="99"/>
     <w:pPr>
       <w:pBdr/>
@@ -18144,9 +18713,9 @@
       </w:tcPr>
     </w:tblStylePr>
   </w:style>
-  <w:style w:type="table" w:styleId="761">
+  <w:style w:type="table" w:styleId="767">
     <w:name w:val="List Table 1 Light"/>
-    <w:basedOn w:val="891"/>
+    <w:basedOn w:val="897"/>
     <w:uiPriority w:val="99"/>
     <w:pPr>
       <w:pBdr/>
@@ -18360,9 +18929,9 @@
       </w:tcPr>
     </w:tblStylePr>
   </w:style>
-  <w:style w:type="table" w:styleId="762">
+  <w:style w:type="table" w:styleId="768">
     <w:name w:val="List Table 1 Light - Accent 1"/>
-    <w:basedOn w:val="891"/>
+    <w:basedOn w:val="897"/>
     <w:uiPriority w:val="99"/>
     <w:pPr>
       <w:pBdr/>
@@ -18576,9 +19145,9 @@
       </w:tcPr>
     </w:tblStylePr>
   </w:style>
-  <w:style w:type="table" w:styleId="763">
+  <w:style w:type="table" w:styleId="769">
     <w:name w:val="List Table 1 Light - Accent 2"/>
-    <w:basedOn w:val="891"/>
+    <w:basedOn w:val="897"/>
     <w:uiPriority w:val="99"/>
     <w:pPr>
       <w:pBdr/>
@@ -18792,9 +19361,9 @@
       </w:tcPr>
     </w:tblStylePr>
   </w:style>
-  <w:style w:type="table" w:styleId="764">
+  <w:style w:type="table" w:styleId="770">
     <w:name w:val="List Table 1 Light - Accent 3"/>
-    <w:basedOn w:val="891"/>
+    <w:basedOn w:val="897"/>
     <w:uiPriority w:val="99"/>
     <w:pPr>
       <w:pBdr/>
@@ -19008,9 +19577,9 @@
       </w:tcPr>
     </w:tblStylePr>
   </w:style>
-  <w:style w:type="table" w:styleId="765">
+  <w:style w:type="table" w:styleId="771">
     <w:name w:val="List Table 1 Light - Accent 4"/>
-    <w:basedOn w:val="891"/>
+    <w:basedOn w:val="897"/>
     <w:uiPriority w:val="99"/>
     <w:pPr>
       <w:pBdr/>
@@ -19224,9 +19793,9 @@
       </w:tcPr>
     </w:tblStylePr>
   </w:style>
-  <w:style w:type="table" w:styleId="766">
+  <w:style w:type="table" w:styleId="772">
     <w:name w:val="List Table 1 Light - Accent 5"/>
-    <w:basedOn w:val="891"/>
+    <w:basedOn w:val="897"/>
     <w:uiPriority w:val="99"/>
     <w:pPr>
       <w:pBdr/>
@@ -19440,9 +20009,9 @@
       </w:tcPr>
     </w:tblStylePr>
   </w:style>
-  <w:style w:type="table" w:styleId="767">
+  <w:style w:type="table" w:styleId="773">
     <w:name w:val="List Table 1 Light - Accent 6"/>
-    <w:basedOn w:val="891"/>
+    <w:basedOn w:val="897"/>
     <w:uiPriority w:val="99"/>
     <w:pPr>
       <w:pBdr/>
@@ -19656,9 +20225,9 @@
       </w:tcPr>
     </w:tblStylePr>
   </w:style>
-  <w:style w:type="table" w:styleId="768">
+  <w:style w:type="table" w:styleId="774">
     <w:name w:val="List Table 2"/>
-    <w:basedOn w:val="891"/>
+    <w:basedOn w:val="897"/>
     <w:uiPriority w:val="99"/>
     <w:pPr>
       <w:pBdr/>
@@ -19894,9 +20463,9 @@
       </w:tcPr>
     </w:tblStylePr>
   </w:style>
-  <w:style w:type="table" w:styleId="769">
+  <w:style w:type="table" w:styleId="775">
     <w:name w:val="List Table 2 - Accent 1"/>
-    <w:basedOn w:val="891"/>
+    <w:basedOn w:val="897"/>
     <w:uiPriority w:val="99"/>
     <w:pPr>
       <w:pBdr/>
@@ -20132,9 +20701,9 @@
       </w:tcPr>
     </w:tblStylePr>
   </w:style>
-  <w:style w:type="table" w:styleId="770">
+  <w:style w:type="table" w:styleId="776">
     <w:name w:val="List Table 2 - Accent 2"/>
-    <w:basedOn w:val="891"/>
+    <w:basedOn w:val="897"/>
     <w:uiPriority w:val="99"/>
     <w:pPr>
       <w:pBdr/>
@@ -20370,9 +20939,9 @@
       </w:tcPr>
     </w:tblStylePr>
   </w:style>
-  <w:style w:type="table" w:styleId="771">
+  <w:style w:type="table" w:styleId="777">
     <w:name w:val="List Table 2 - Accent 3"/>
-    <w:basedOn w:val="891"/>
+    <w:basedOn w:val="897"/>
     <w:uiPriority w:val="99"/>
     <w:pPr>
       <w:pBdr/>
@@ -20608,9 +21177,9 @@
       </w:tcPr>
     </w:tblStylePr>
   </w:style>
-  <w:style w:type="table" w:styleId="772">
+  <w:style w:type="table" w:styleId="778">
     <w:name w:val="List Table 2 - Accent 4"/>
-    <w:basedOn w:val="891"/>
+    <w:basedOn w:val="897"/>
     <w:uiPriority w:val="99"/>
     <w:pPr>
       <w:pBdr/>
@@ -20846,9 +21415,9 @@
       </w:tcPr>
     </w:tblStylePr>
   </w:style>
-  <w:style w:type="table" w:styleId="773">
+  <w:style w:type="table" w:styleId="779">
     <w:name w:val="List Table 2 - Accent 5"/>
-    <w:basedOn w:val="891"/>
+    <w:basedOn w:val="897"/>
     <w:uiPriority w:val="99"/>
     <w:pPr>
       <w:pBdr/>
@@ -21084,9 +21653,9 @@
       </w:tcPr>
     </w:tblStylePr>
   </w:style>
-  <w:style w:type="table" w:styleId="774">
+  <w:style w:type="table" w:styleId="780">
     <w:name w:val="List Table 2 - Accent 6"/>
-    <w:basedOn w:val="891"/>
+    <w:basedOn w:val="897"/>
     <w:uiPriority w:val="99"/>
     <w:pPr>
       <w:pBdr/>
@@ -21322,9 +21891,9 @@
       </w:tcPr>
     </w:tblStylePr>
   </w:style>
-  <w:style w:type="table" w:styleId="775">
+  <w:style w:type="table" w:styleId="781">
     <w:name w:val="List Table 3"/>
-    <w:basedOn w:val="891"/>
+    <w:basedOn w:val="897"/>
     <w:uiPriority w:val="99"/>
     <w:pPr>
       <w:pBdr/>
@@ -21550,9 +22119,9 @@
       </w:tcPr>
     </w:tblStylePr>
   </w:style>
-  <w:style w:type="table" w:styleId="776">
+  <w:style w:type="table" w:styleId="782">
     <w:name w:val="List Table 3 - Accent 1"/>
-    <w:basedOn w:val="891"/>
+    <w:basedOn w:val="897"/>
     <w:uiPriority w:val="99"/>
     <w:pPr>
       <w:pBdr/>
@@ -21778,9 +22347,9 @@
       </w:tcPr>
     </w:tblStylePr>
   </w:style>
-  <w:style w:type="table" w:styleId="777">
+  <w:style w:type="table" w:styleId="783">
     <w:name w:val="List Table 3 - Accent 2"/>
-    <w:basedOn w:val="891"/>
+    <w:basedOn w:val="897"/>
     <w:uiPriority w:val="99"/>
     <w:pPr>
       <w:pBdr/>
@@ -22006,9 +22575,9 @@
       </w:tcPr>
     </w:tblStylePr>
   </w:style>
-  <w:style w:type="table" w:styleId="778">
+  <w:style w:type="table" w:styleId="784">
     <w:name w:val="List Table 3 - Accent 3"/>
-    <w:basedOn w:val="891"/>
+    <w:basedOn w:val="897"/>
     <w:uiPriority w:val="99"/>
     <w:pPr>
       <w:pBdr/>
@@ -22234,9 +22803,9 @@
       </w:tcPr>
     </w:tblStylePr>
   </w:style>
-  <w:style w:type="table" w:styleId="779">
+  <w:style w:type="table" w:styleId="785">
     <w:name w:val="List Table 3 - Accent 4"/>
-    <w:basedOn w:val="891"/>
+    <w:basedOn w:val="897"/>
     <w:uiPriority w:val="99"/>
     <w:pPr>
       <w:pBdr/>
@@ -22462,9 +23031,9 @@
       </w:tcPr>
     </w:tblStylePr>
   </w:style>
-  <w:style w:type="table" w:styleId="780">
+  <w:style w:type="table" w:styleId="786">
     <w:name w:val="List Table 3 - Accent 5"/>
-    <w:basedOn w:val="891"/>
+    <w:basedOn w:val="897"/>
     <w:uiPriority w:val="99"/>
     <w:pPr>
       <w:pBdr/>
@@ -22690,9 +23259,9 @@
       </w:tcPr>
     </w:tblStylePr>
   </w:style>
-  <w:style w:type="table" w:styleId="781">
+  <w:style w:type="table" w:styleId="787">
     <w:name w:val="List Table 3 - Accent 6"/>
-    <w:basedOn w:val="891"/>
+    <w:basedOn w:val="897"/>
     <w:uiPriority w:val="99"/>
     <w:pPr>
       <w:pBdr/>
@@ -22918,9 +23487,9 @@
       </w:tcPr>
     </w:tblStylePr>
   </w:style>
-  <w:style w:type="table" w:styleId="782">
+  <w:style w:type="table" w:styleId="788">
     <w:name w:val="List Table 4"/>
-    <w:basedOn w:val="891"/>
+    <w:basedOn w:val="897"/>
     <w:uiPriority w:val="99"/>
     <w:pPr>
       <w:pBdr/>
@@ -23143,9 +23712,9 @@
       </w:tcPr>
     </w:tblStylePr>
   </w:style>
-  <w:style w:type="table" w:styleId="783">
+  <w:style w:type="table" w:styleId="789">
     <w:name w:val="List Table 4 - Accent 1"/>
-    <w:basedOn w:val="891"/>
+    <w:basedOn w:val="897"/>
     <w:uiPriority w:val="99"/>
     <w:pPr>
       <w:pBdr/>
@@ -23368,9 +23937,9 @@
       </w:tcPr>
     </w:tblStylePr>
   </w:style>
-  <w:style w:type="table" w:styleId="784">
+  <w:style w:type="table" w:styleId="790">
     <w:name w:val="List Table 4 - Accent 2"/>
-    <w:basedOn w:val="891"/>
+    <w:basedOn w:val="897"/>
     <w:uiPriority w:val="99"/>
     <w:pPr>
       <w:pBdr/>
@@ -23593,9 +24162,9 @@
       </w:tcPr>
     </w:tblStylePr>
   </w:style>
-  <w:style w:type="table" w:styleId="785">
+  <w:style w:type="table" w:styleId="791">
     <w:name w:val="List Table 4 - Accent 3"/>
-    <w:basedOn w:val="891"/>
+    <w:basedOn w:val="897"/>
     <w:uiPriority w:val="99"/>
     <w:pPr>
       <w:pBdr/>
@@ -23818,9 +24387,9 @@
       </w:tcPr>
     </w:tblStylePr>
   </w:style>
-  <w:style w:type="table" w:styleId="786">
+  <w:style w:type="table" w:styleId="792">
     <w:name w:val="List Table 4 - Accent 4"/>
-    <w:basedOn w:val="891"/>
+    <w:basedOn w:val="897"/>
     <w:uiPriority w:val="99"/>
     <w:pPr>
       <w:pBdr/>
@@ -24043,9 +24612,9 @@
       </w:tcPr>
     </w:tblStylePr>
   </w:style>
-  <w:style w:type="table" w:styleId="787">
+  <w:style w:type="table" w:styleId="793">
     <w:name w:val="List Table 4 - Accent 5"/>
-    <w:basedOn w:val="891"/>
+    <w:basedOn w:val="897"/>
     <w:uiPriority w:val="99"/>
     <w:pPr>
       <w:pBdr/>
@@ -24268,9 +24837,9 @@
       </w:tcPr>
     </w:tblStylePr>
   </w:style>
-  <w:style w:type="table" w:styleId="788">
+  <w:style w:type="table" w:styleId="794">
     <w:name w:val="List Table 4 - Accent 6"/>
-    <w:basedOn w:val="891"/>
+    <w:basedOn w:val="897"/>
     <w:uiPriority w:val="99"/>
     <w:pPr>
       <w:pBdr/>
@@ -24493,9 +25062,9 @@
       </w:tcPr>
     </w:tblStylePr>
   </w:style>
-  <w:style w:type="table" w:styleId="789">
+  <w:style w:type="table" w:styleId="795">
     <w:name w:val="List Table 5 Dark"/>
-    <w:basedOn w:val="891"/>
+    <w:basedOn w:val="897"/>
     <w:uiPriority w:val="99"/>
     <w:pPr>
       <w:pBdr/>
@@ -24735,9 +25304,9 @@
       </w:tcPr>
     </w:tblStylePr>
   </w:style>
-  <w:style w:type="table" w:styleId="790">
+  <w:style w:type="table" w:styleId="796">
     <w:name w:val="List Table 5 Dark - Accent 1"/>
-    <w:basedOn w:val="891"/>
+    <w:basedOn w:val="897"/>
     <w:uiPriority w:val="99"/>
     <w:pPr>
       <w:pBdr/>
@@ -24977,9 +25546,9 @@
       </w:tcPr>
     </w:tblStylePr>
   </w:style>
-  <w:style w:type="table" w:styleId="791">
+  <w:style w:type="table" w:styleId="797">
     <w:name w:val="List Table 5 Dark - Accent 2"/>
-    <w:basedOn w:val="891"/>
+    <w:basedOn w:val="897"/>
     <w:uiPriority w:val="99"/>
     <w:pPr>
       <w:pBdr/>
@@ -25219,9 +25788,9 @@
       </w:tcPr>
     </w:tblStylePr>
   </w:style>
-  <w:style w:type="table" w:styleId="792">
+  <w:style w:type="table" w:styleId="798">
     <w:name w:val="List Table 5 Dark - Accent 3"/>
-    <w:basedOn w:val="891"/>
+    <w:basedOn w:val="897"/>
     <w:uiPriority w:val="99"/>
     <w:pPr>
       <w:pBdr/>
@@ -25461,9 +26030,9 @@
       </w:tcPr>
     </w:tblStylePr>
   </w:style>
-  <w:style w:type="table" w:styleId="793">
+  <w:style w:type="table" w:styleId="799">
     <w:name w:val="List Table 5 Dark - Accent 4"/>
-    <w:basedOn w:val="891"/>
+    <w:basedOn w:val="897"/>
     <w:uiPriority w:val="99"/>
     <w:pPr>
       <w:pBdr/>
@@ -25703,9 +26272,9 @@
       </w:tcPr>
     </w:tblStylePr>
   </w:style>
-  <w:style w:type="table" w:styleId="794">
+  <w:style w:type="table" w:styleId="800">
     <w:name w:val="List Table 5 Dark - Accent 5"/>
-    <w:basedOn w:val="891"/>
+    <w:basedOn w:val="897"/>
     <w:uiPriority w:val="99"/>
     <w:pPr>
       <w:pBdr/>
@@ -25945,9 +26514,9 @@
       </w:tcPr>
     </w:tblStylePr>
   </w:style>
-  <w:style w:type="table" w:styleId="795">
+  <w:style w:type="table" w:styleId="801">
     <w:name w:val="List Table 5 Dark - Accent 6"/>
-    <w:basedOn w:val="891"/>
+    <w:basedOn w:val="897"/>
     <w:uiPriority w:val="99"/>
     <w:pPr>
       <w:pBdr/>
@@ -26187,9 +26756,9 @@
       </w:tcPr>
     </w:tblStylePr>
   </w:style>
-  <w:style w:type="table" w:styleId="796">
+  <w:style w:type="table" w:styleId="802">
     <w:name w:val="List Table 6 Colorful"/>
-    <w:basedOn w:val="891"/>
+    <w:basedOn w:val="897"/>
     <w:uiPriority w:val="99"/>
     <w:pPr>
       <w:pBdr/>
@@ -26410,9 +26979,9 @@
       </w:tcPr>
     </w:tblStylePr>
   </w:style>
-  <w:style w:type="table" w:styleId="797">
+  <w:style w:type="table" w:styleId="803">
     <w:name w:val="List Table 6 Colorful - Accent 1"/>
-    <w:basedOn w:val="891"/>
+    <w:basedOn w:val="897"/>
     <w:uiPriority w:val="99"/>
     <w:pPr>
       <w:pBdr/>
@@ -26633,9 +27202,9 @@
       </w:tcPr>
     </w:tblStylePr>
   </w:style>
-  <w:style w:type="table" w:styleId="798">
+  <w:style w:type="table" w:styleId="804">
     <w:name w:val="List Table 6 Colorful - Accent 2"/>
-    <w:basedOn w:val="891"/>
+    <w:basedOn w:val="897"/>
     <w:uiPriority w:val="99"/>
     <w:pPr>
       <w:pBdr/>
@@ -26856,9 +27425,9 @@
       </w:tcPr>
     </w:tblStylePr>
   </w:style>
-  <w:style w:type="table" w:styleId="799">
+  <w:style w:type="table" w:styleId="805">
     <w:name w:val="List Table 6 Colorful - Accent 3"/>
-    <w:basedOn w:val="891"/>
+    <w:basedOn w:val="897"/>
     <w:uiPriority w:val="99"/>
     <w:pPr>
       <w:pBdr/>
@@ -27079,9 +27648,9 @@
       </w:tcPr>
     </w:tblStylePr>
   </w:style>
-  <w:style w:type="table" w:styleId="800">
+  <w:style w:type="table" w:styleId="806">
     <w:name w:val="List Table 6 Colorful - Accent 4"/>
-    <w:basedOn w:val="891"/>
+    <w:basedOn w:val="897"/>
     <w:uiPriority w:val="99"/>
     <w:pPr>
       <w:pBdr/>
@@ -27302,9 +27871,9 @@
       </w:tcPr>
     </w:tblStylePr>
   </w:style>
-  <w:style w:type="table" w:styleId="801">
+  <w:style w:type="table" w:styleId="807">
     <w:name w:val="List Table 6 Colorful - Accent 5"/>
-    <w:basedOn w:val="891"/>
+    <w:basedOn w:val="897"/>
     <w:uiPriority w:val="99"/>
     <w:pPr>
       <w:pBdr/>
@@ -27525,9 +28094,9 @@
       </w:tcPr>
     </w:tblStylePr>
   </w:style>
-  <w:style w:type="table" w:styleId="802">
+  <w:style w:type="table" w:styleId="808">
     <w:name w:val="List Table 6 Colorful - Accent 6"/>
-    <w:basedOn w:val="891"/>
+    <w:basedOn w:val="897"/>
     <w:uiPriority w:val="99"/>
     <w:pPr>
       <w:pBdr/>
@@ -27748,9 +28317,9 @@
       </w:tcPr>
     </w:tblStylePr>
   </w:style>
-  <w:style w:type="table" w:styleId="803">
+  <w:style w:type="table" w:styleId="809">
     <w:name w:val="List Table 7 Colorful"/>
-    <w:basedOn w:val="891"/>
+    <w:basedOn w:val="897"/>
     <w:uiPriority w:val="99"/>
     <w:pPr>
       <w:pBdr/>
@@ -28004,9 +28573,9 @@
       </w:tcPr>
     </w:tblStylePr>
   </w:style>
-  <w:style w:type="table" w:styleId="804">
+  <w:style w:type="table" w:styleId="810">
     <w:name w:val="List Table 7 Colorful - Accent 1"/>
-    <w:basedOn w:val="891"/>
+    <w:basedOn w:val="897"/>
     <w:uiPriority w:val="99"/>
     <w:pPr>
       <w:pBdr/>
@@ -28260,9 +28829,9 @@
       </w:tcPr>
     </w:tblStylePr>
   </w:style>
-  <w:style w:type="table" w:styleId="805">
+  <w:style w:type="table" w:styleId="811">
     <w:name w:val="List Table 7 Colorful - Accent 2"/>
-    <w:basedOn w:val="891"/>
+    <w:basedOn w:val="897"/>
     <w:uiPriority w:val="99"/>
     <w:pPr>
       <w:pBdr/>
@@ -28516,9 +29085,9 @@
       </w:tcPr>
     </w:tblStylePr>
   </w:style>
-  <w:style w:type="table" w:styleId="806">
+  <w:style w:type="table" w:styleId="812">
     <w:name w:val="List Table 7 Colorful - Accent 3"/>
-    <w:basedOn w:val="891"/>
+    <w:basedOn w:val="897"/>
     <w:uiPriority w:val="99"/>
     <w:pPr>
       <w:pBdr/>
@@ -28772,9 +29341,9 @@
       </w:tcPr>
     </w:tblStylePr>
   </w:style>
-  <w:style w:type="table" w:styleId="807">
+  <w:style w:type="table" w:styleId="813">
     <w:name w:val="List Table 7 Colorful - Accent 4"/>
-    <w:basedOn w:val="891"/>
+    <w:basedOn w:val="897"/>
     <w:uiPriority w:val="99"/>
     <w:pPr>
       <w:pBdr/>
@@ -29028,9 +29597,9 @@
       </w:tcPr>
     </w:tblStylePr>
   </w:style>
-  <w:style w:type="table" w:styleId="808">
+  <w:style w:type="table" w:styleId="814">
     <w:name w:val="List Table 7 Colorful - Accent 5"/>
-    <w:basedOn w:val="891"/>
+    <w:basedOn w:val="897"/>
     <w:uiPriority w:val="99"/>
     <w:pPr>
       <w:pBdr/>
@@ -29284,9 +29853,9 @@
       </w:tcPr>
     </w:tblStylePr>
   </w:style>
-  <w:style w:type="table" w:styleId="809">
+  <w:style w:type="table" w:styleId="815">
     <w:name w:val="List Table 7 Colorful - Accent 6"/>
-    <w:basedOn w:val="891"/>
+    <w:basedOn w:val="897"/>
     <w:uiPriority w:val="99"/>
     <w:pPr>
       <w:pBdr/>
@@ -29540,9 +30109,9 @@
       </w:tcPr>
     </w:tblStylePr>
   </w:style>
-  <w:style w:type="table" w:styleId="810">
+  <w:style w:type="table" w:styleId="816">
     <w:name w:val="Lined - Accent"/>
-    <w:basedOn w:val="891"/>
+    <w:basedOn w:val="897"/>
     <w:uiPriority w:val="99"/>
     <w:pPr>
       <w:pBdr/>
@@ -29777,9 +30346,9 @@
       </w:tcPr>
     </w:tblStylePr>
   </w:style>
-  <w:style w:type="table" w:styleId="811">
+  <w:style w:type="table" w:styleId="817">
     <w:name w:val="Lined - Accent 1"/>
-    <w:basedOn w:val="891"/>
+    <w:basedOn w:val="897"/>
     <w:uiPriority w:val="99"/>
     <w:pPr>
       <w:pBdr/>
@@ -30014,9 +30583,9 @@
       </w:tcPr>
     </w:tblStylePr>
   </w:style>
-  <w:style w:type="table" w:styleId="812">
+  <w:style w:type="table" w:styleId="818">
     <w:name w:val="Lined - Accent 2"/>
-    <w:basedOn w:val="891"/>
+    <w:basedOn w:val="897"/>
     <w:uiPriority w:val="99"/>
     <w:pPr>
       <w:pBdr/>
@@ -30251,9 +30820,9 @@
       </w:tcPr>
     </w:tblStylePr>
   </w:style>
-  <w:style w:type="table" w:styleId="813">
+  <w:style w:type="table" w:styleId="819">
     <w:name w:val="Lined - Accent 3"/>
-    <w:basedOn w:val="891"/>
+    <w:basedOn w:val="897"/>
     <w:uiPriority w:val="99"/>
     <w:pPr>
       <w:pBdr/>
@@ -30488,9 +31057,9 @@
       </w:tcPr>
     </w:tblStylePr>
   </w:style>
-  <w:style w:type="table" w:styleId="814">
+  <w:style w:type="table" w:styleId="820">
     <w:name w:val="Lined - Accent 4"/>
-    <w:basedOn w:val="891"/>
+    <w:basedOn w:val="897"/>
     <w:uiPriority w:val="99"/>
     <w:pPr>
       <w:pBdr/>
@@ -30725,9 +31294,9 @@
       </w:tcPr>
     </w:tblStylePr>
   </w:style>
-  <w:style w:type="table" w:styleId="815">
+  <w:style w:type="table" w:styleId="821">
     <w:name w:val="Lined - Accent 5"/>
-    <w:basedOn w:val="891"/>
+    <w:basedOn w:val="897"/>
     <w:uiPriority w:val="99"/>
     <w:pPr>
       <w:pBdr/>
@@ -30962,9 +31531,9 @@
       </w:tcPr>
     </w:tblStylePr>
   </w:style>
-  <w:style w:type="table" w:styleId="816">
+  <w:style w:type="table" w:styleId="822">
     <w:name w:val="Lined - Accent 6"/>
-    <w:basedOn w:val="891"/>
+    <w:basedOn w:val="897"/>
     <w:uiPriority w:val="99"/>
     <w:pPr>
       <w:pBdr/>
@@ -31199,9 +31768,9 @@
       </w:tcPr>
     </w:tblStylePr>
   </w:style>
-  <w:style w:type="table" w:styleId="817">
+  <w:style w:type="table" w:styleId="823">
     <w:name w:val="Bordered &amp; Lined - Accent"/>
-    <w:basedOn w:val="891"/>
+    <w:basedOn w:val="897"/>
     <w:uiPriority w:val="99"/>
     <w:pPr>
       <w:pBdr/>
@@ -31443,9 +32012,9 @@
       </w:tcPr>
     </w:tblStylePr>
   </w:style>
-  <w:style w:type="table" w:styleId="818">
+  <w:style w:type="table" w:styleId="824">
     <w:name w:val="Bordered &amp; Lined - Accent 1"/>
-    <w:basedOn w:val="891"/>
+    <w:basedOn w:val="897"/>
     <w:uiPriority w:val="99"/>
     <w:pPr>
       <w:pBdr/>
@@ -31687,9 +32256,9 @@
       </w:tcPr>
     </w:tblStylePr>
   </w:style>
-  <w:style w:type="table" w:styleId="819">
+  <w:style w:type="table" w:styleId="825">
     <w:name w:val="Bordered &amp; Lined - Accent 2"/>
-    <w:basedOn w:val="891"/>
+    <w:basedOn w:val="897"/>
     <w:uiPriority w:val="99"/>
     <w:pPr>
       <w:pBdr/>
@@ -31931,9 +32500,9 @@
       </w:tcPr>
     </w:tblStylePr>
   </w:style>
-  <w:style w:type="table" w:styleId="820">
+  <w:style w:type="table" w:styleId="826">
     <w:name w:val="Bordered &amp; Lined - Accent 3"/>
-    <w:basedOn w:val="891"/>
+    <w:basedOn w:val="897"/>
     <w:uiPriority w:val="99"/>
     <w:pPr>
       <w:pBdr/>
@@ -32175,9 +32744,9 @@
       </w:tcPr>
     </w:tblStylePr>
   </w:style>
-  <w:style w:type="table" w:styleId="821">
+  <w:style w:type="table" w:styleId="827">
     <w:name w:val="Bordered &amp; Lined - Accent 4"/>
-    <w:basedOn w:val="891"/>
+    <w:basedOn w:val="897"/>
     <w:uiPriority w:val="99"/>
     <w:pPr>
       <w:pBdr/>
@@ -32419,9 +32988,9 @@
       </w:tcPr>
     </w:tblStylePr>
   </w:style>
-  <w:style w:type="table" w:styleId="822">
+  <w:style w:type="table" w:styleId="828">
     <w:name w:val="Bordered &amp; Lined - Accent 5"/>
-    <w:basedOn w:val="891"/>
+    <w:basedOn w:val="897"/>
     <w:uiPriority w:val="99"/>
     <w:pPr>
       <w:pBdr/>
@@ -32663,9 +33232,9 @@
       </w:tcPr>
     </w:tblStylePr>
   </w:style>
-  <w:style w:type="table" w:styleId="823">
+  <w:style w:type="table" w:styleId="829">
     <w:name w:val="Bordered &amp; Lined - Accent 6"/>
-    <w:basedOn w:val="891"/>
+    <w:basedOn w:val="897"/>
     <w:uiPriority w:val="99"/>
     <w:pPr>
       <w:pBdr/>
@@ -32907,9 +33476,9 @@
       </w:tcPr>
     </w:tblStylePr>
   </w:style>
-  <w:style w:type="table" w:styleId="824">
+  <w:style w:type="table" w:styleId="830">
     <w:name w:val="Bordered"/>
-    <w:basedOn w:val="891"/>
+    <w:basedOn w:val="897"/>
     <w:uiPriority w:val="99"/>
     <w:pPr>
       <w:pBdr/>
@@ -33138,9 +33707,9 @@
       </w:tcPr>
     </w:tblStylePr>
   </w:style>
-  <w:style w:type="table" w:styleId="825">
+  <w:style w:type="table" w:styleId="831">
     <w:name w:val="Bordered - Accent 1"/>
-    <w:basedOn w:val="891"/>
+    <w:basedOn w:val="897"/>
     <w:uiPriority w:val="99"/>
     <w:pPr>
       <w:pBdr/>
@@ -33369,9 +33938,9 @@
       </w:tcPr>
     </w:tblStylePr>
   </w:style>
-  <w:style w:type="table" w:styleId="826">
+  <w:style w:type="table" w:styleId="832">
     <w:name w:val="Bordered - Accent 2"/>
-    <w:basedOn w:val="891"/>
+    <w:basedOn w:val="897"/>
     <w:uiPriority w:val="99"/>
     <w:pPr>
       <w:pBdr/>
@@ -33600,9 +34169,9 @@
       </w:tcPr>
     </w:tblStylePr>
   </w:style>
-  <w:style w:type="table" w:styleId="827">
+  <w:style w:type="table" w:styleId="833">
     <w:name w:val="Bordered - Accent 3"/>
-    <w:basedOn w:val="891"/>
+    <w:basedOn w:val="897"/>
     <w:uiPriority w:val="99"/>
     <w:pPr>
       <w:pBdr/>
@@ -33831,9 +34400,9 @@
       </w:tcPr>
     </w:tblStylePr>
   </w:style>
-  <w:style w:type="table" w:styleId="828">
+  <w:style w:type="table" w:styleId="834">
     <w:name w:val="Bordered - Accent 4"/>
-    <w:basedOn w:val="891"/>
+    <w:basedOn w:val="897"/>
     <w:uiPriority w:val="99"/>
     <w:pPr>
       <w:pBdr/>
@@ -34062,9 +34631,9 @@
       </w:tcPr>
     </w:tblStylePr>
   </w:style>
-  <w:style w:type="table" w:styleId="829">
+  <w:style w:type="table" w:styleId="835">
     <w:name w:val="Bordered - Accent 5"/>
-    <w:basedOn w:val="891"/>
+    <w:basedOn w:val="897"/>
     <w:uiPriority w:val="99"/>
     <w:pPr>
       <w:pBdr/>
@@ -34293,9 +34862,9 @@
       </w:tcPr>
     </w:tblStylePr>
   </w:style>
-  <w:style w:type="table" w:styleId="830">
+  <w:style w:type="table" w:styleId="836">
     <w:name w:val="Bordered - Accent 6"/>
-    <w:basedOn w:val="891"/>
+    <w:basedOn w:val="897"/>
     <w:uiPriority w:val="99"/>
     <w:pPr>
       <w:pBdr/>
@@ -34524,11 +35093,11 @@
       </w:tcPr>
     </w:tblStylePr>
   </w:style>
-  <w:style w:type="paragraph" w:styleId="831">
+  <w:style w:type="paragraph" w:styleId="837">
     <w:name w:val="Heading 1"/>
-    <w:basedOn w:val="890"/>
-    <w:next w:val="890"/>
-    <w:link w:val="841"/>
+    <w:basedOn w:val="896"/>
+    <w:next w:val="896"/>
+    <w:link w:val="847"/>
     <w:uiPriority w:val="9"/>
     <w:qFormat/>
     <w:pPr>
@@ -34546,11 +35115,11 @@
       <w:szCs w:val="40"/>
     </w:rPr>
   </w:style>
-  <w:style w:type="paragraph" w:styleId="832">
+  <w:style w:type="paragraph" w:styleId="838">
     <w:name w:val="Heading 2"/>
-    <w:basedOn w:val="890"/>
-    <w:next w:val="890"/>
-    <w:link w:val="842"/>
+    <w:basedOn w:val="896"/>
+    <w:next w:val="896"/>
+    <w:link w:val="848"/>
     <w:uiPriority w:val="9"/>
     <w:unhideWhenUsed/>
     <w:qFormat/>
@@ -34569,11 +35138,11 @@
       <w:szCs w:val="32"/>
     </w:rPr>
   </w:style>
-  <w:style w:type="paragraph" w:styleId="833">
+  <w:style w:type="paragraph" w:styleId="839">
     <w:name w:val="Heading 3"/>
-    <w:basedOn w:val="890"/>
-    <w:next w:val="890"/>
-    <w:link w:val="843"/>
+    <w:basedOn w:val="896"/>
+    <w:next w:val="896"/>
+    <w:link w:val="849"/>
     <w:uiPriority w:val="9"/>
     <w:unhideWhenUsed/>
     <w:qFormat/>
@@ -34592,11 +35161,11 @@
       <w:szCs w:val="28"/>
     </w:rPr>
   </w:style>
-  <w:style w:type="paragraph" w:styleId="834">
+  <w:style w:type="paragraph" w:styleId="840">
     <w:name w:val="Heading 4"/>
-    <w:basedOn w:val="890"/>
-    <w:next w:val="890"/>
-    <w:link w:val="844"/>
+    <w:basedOn w:val="896"/>
+    <w:next w:val="896"/>
+    <w:link w:val="850"/>
     <w:uiPriority w:val="9"/>
     <w:unhideWhenUsed/>
     <w:qFormat/>
@@ -34615,11 +35184,11 @@
       <w:color w:val="0f4761" w:themeColor="accent1" w:themeShade="BF"/>
     </w:rPr>
   </w:style>
-  <w:style w:type="paragraph" w:styleId="835">
+  <w:style w:type="paragraph" w:styleId="841">
     <w:name w:val="Heading 5"/>
-    <w:basedOn w:val="890"/>
-    <w:next w:val="890"/>
-    <w:link w:val="845"/>
+    <w:basedOn w:val="896"/>
+    <w:next w:val="896"/>
+    <w:link w:val="851"/>
     <w:uiPriority w:val="9"/>
     <w:unhideWhenUsed/>
     <w:qFormat/>
@@ -34636,11 +35205,11 @@
       <w:color w:val="0f4761" w:themeColor="accent1" w:themeShade="BF"/>
     </w:rPr>
   </w:style>
-  <w:style w:type="paragraph" w:styleId="836">
+  <w:style w:type="paragraph" w:styleId="842">
     <w:name w:val="Heading 6"/>
-    <w:basedOn w:val="890"/>
-    <w:next w:val="890"/>
-    <w:link w:val="846"/>
+    <w:basedOn w:val="896"/>
+    <w:next w:val="896"/>
+    <w:link w:val="852"/>
     <w:uiPriority w:val="9"/>
     <w:unhideWhenUsed/>
     <w:qFormat/>
@@ -34659,11 +35228,11 @@
       <w:color w:val="595959" w:themeColor="text1" w:themeTint="A6"/>
     </w:rPr>
   </w:style>
-  <w:style w:type="paragraph" w:styleId="837">
+  <w:style w:type="paragraph" w:styleId="843">
     <w:name w:val="Heading 7"/>
-    <w:basedOn w:val="890"/>
-    <w:next w:val="890"/>
-    <w:link w:val="847"/>
+    <w:basedOn w:val="896"/>
+    <w:next w:val="896"/>
+    <w:link w:val="853"/>
     <w:uiPriority w:val="9"/>
     <w:unhideWhenUsed/>
     <w:qFormat/>
@@ -34680,11 +35249,11 @@
       <w:color w:val="595959" w:themeColor="text1" w:themeTint="A6"/>
     </w:rPr>
   </w:style>
-  <w:style w:type="paragraph" w:styleId="838">
+  <w:style w:type="paragraph" w:styleId="844">
     <w:name w:val="Heading 8"/>
-    <w:basedOn w:val="890"/>
-    <w:next w:val="890"/>
-    <w:link w:val="848"/>
+    <w:basedOn w:val="896"/>
+    <w:next w:val="896"/>
+    <w:link w:val="854"/>
     <w:uiPriority w:val="9"/>
     <w:unhideWhenUsed/>
     <w:qFormat/>
@@ -34703,11 +35272,11 @@
       <w:color w:val="272727" w:themeColor="text1" w:themeTint="D8"/>
     </w:rPr>
   </w:style>
-  <w:style w:type="paragraph" w:styleId="839">
+  <w:style w:type="paragraph" w:styleId="845">
     <w:name w:val="Heading 9"/>
-    <w:basedOn w:val="890"/>
-    <w:next w:val="890"/>
-    <w:link w:val="849"/>
+    <w:basedOn w:val="896"/>
+    <w:next w:val="896"/>
+    <w:link w:val="855"/>
     <w:uiPriority w:val="9"/>
     <w:unhideWhenUsed/>
     <w:qFormat/>
@@ -34726,7 +35295,7 @@
       <w:color w:val="272727" w:themeColor="text1" w:themeTint="D8"/>
     </w:rPr>
   </w:style>
-  <w:style w:type="character" w:styleId="840" w:default="1">
+  <w:style w:type="character" w:styleId="846" w:default="1">
     <w:name w:val="Default Paragraph Font"/>
     <w:uiPriority w:val="1"/>
     <w:semiHidden/>
@@ -34737,10 +35306,10 @@
       <w:ind/>
     </w:pPr>
   </w:style>
-  <w:style w:type="character" w:styleId="841">
+  <w:style w:type="character" w:styleId="847">
     <w:name w:val="Heading 1 Char"/>
-    <w:basedOn w:val="840"/>
-    <w:link w:val="831"/>
+    <w:basedOn w:val="846"/>
+    <w:link w:val="837"/>
     <w:uiPriority w:val="9"/>
     <w:pPr>
       <w:pBdr/>
@@ -34754,10 +35323,10 @@
       <w:szCs w:val="40"/>
     </w:rPr>
   </w:style>
-  <w:style w:type="character" w:styleId="842">
+  <w:style w:type="character" w:styleId="848">
     <w:name w:val="Heading 2 Char"/>
-    <w:basedOn w:val="840"/>
-    <w:link w:val="832"/>
+    <w:basedOn w:val="846"/>
+    <w:link w:val="838"/>
     <w:uiPriority w:val="9"/>
     <w:pPr>
       <w:pBdr/>
@@ -34771,10 +35340,10 @@
       <w:szCs w:val="32"/>
     </w:rPr>
   </w:style>
-  <w:style w:type="character" w:styleId="843">
+  <w:style w:type="character" w:styleId="849">
     <w:name w:val="Heading 3 Char"/>
-    <w:basedOn w:val="840"/>
-    <w:link w:val="833"/>
+    <w:basedOn w:val="846"/>
+    <w:link w:val="839"/>
     <w:uiPriority w:val="9"/>
     <w:pPr>
       <w:pBdr/>
@@ -34788,10 +35357,10 @@
       <w:szCs w:val="28"/>
     </w:rPr>
   </w:style>
-  <w:style w:type="character" w:styleId="844">
+  <w:style w:type="character" w:styleId="850">
     <w:name w:val="Heading 4 Char"/>
-    <w:basedOn w:val="840"/>
-    <w:link w:val="834"/>
+    <w:basedOn w:val="846"/>
+    <w:link w:val="840"/>
     <w:uiPriority w:val="9"/>
     <w:pPr>
       <w:pBdr/>
@@ -34805,10 +35374,10 @@
       <w:color w:val="0f4761" w:themeColor="accent1" w:themeShade="BF"/>
     </w:rPr>
   </w:style>
-  <w:style w:type="character" w:styleId="845">
+  <w:style w:type="character" w:styleId="851">
     <w:name w:val="Heading 5 Char"/>
-    <w:basedOn w:val="840"/>
-    <w:link w:val="835"/>
+    <w:basedOn w:val="846"/>
+    <w:link w:val="841"/>
     <w:uiPriority w:val="9"/>
     <w:pPr>
       <w:pBdr/>
@@ -34820,10 +35389,10 @@
       <w:color w:val="0f4761" w:themeColor="accent1" w:themeShade="BF"/>
     </w:rPr>
   </w:style>
-  <w:style w:type="character" w:styleId="846">
+  <w:style w:type="character" w:styleId="852">
     <w:name w:val="Heading 6 Char"/>
-    <w:basedOn w:val="840"/>
-    <w:link w:val="836"/>
+    <w:basedOn w:val="846"/>
+    <w:link w:val="842"/>
     <w:uiPriority w:val="9"/>
     <w:pPr>
       <w:pBdr/>
@@ -34837,10 +35406,10 @@
       <w:color w:val="595959" w:themeColor="text1" w:themeTint="A6"/>
     </w:rPr>
   </w:style>
-  <w:style w:type="character" w:styleId="847">
+  <w:style w:type="character" w:styleId="853">
     <w:name w:val="Heading 7 Char"/>
-    <w:basedOn w:val="840"/>
-    <w:link w:val="837"/>
+    <w:basedOn w:val="846"/>
+    <w:link w:val="843"/>
     <w:uiPriority w:val="9"/>
     <w:pPr>
       <w:pBdr/>
@@ -34852,10 +35421,10 @@
       <w:color w:val="595959" w:themeColor="text1" w:themeTint="A6"/>
     </w:rPr>
   </w:style>
-  <w:style w:type="character" w:styleId="848">
+  <w:style w:type="character" w:styleId="854">
     <w:name w:val="Heading 8 Char"/>
-    <w:basedOn w:val="840"/>
-    <w:link w:val="838"/>
+    <w:basedOn w:val="846"/>
+    <w:link w:val="844"/>
     <w:uiPriority w:val="9"/>
     <w:pPr>
       <w:pBdr/>
@@ -34869,10 +35438,10 @@
       <w:color w:val="272727" w:themeColor="text1" w:themeTint="D8"/>
     </w:rPr>
   </w:style>
-  <w:style w:type="character" w:styleId="849">
+  <w:style w:type="character" w:styleId="855">
     <w:name w:val="Heading 9 Char"/>
-    <w:basedOn w:val="840"/>
-    <w:link w:val="839"/>
+    <w:basedOn w:val="846"/>
+    <w:link w:val="845"/>
     <w:uiPriority w:val="9"/>
     <w:pPr>
       <w:pBdr/>
@@ -34886,11 +35455,11 @@
       <w:color w:val="272727" w:themeColor="text1" w:themeTint="D8"/>
     </w:rPr>
   </w:style>
-  <w:style w:type="paragraph" w:styleId="850">
+  <w:style w:type="paragraph" w:styleId="856">
     <w:name w:val="Title"/>
-    <w:basedOn w:val="890"/>
-    <w:next w:val="890"/>
-    <w:link w:val="851"/>
+    <w:basedOn w:val="896"/>
+    <w:next w:val="896"/>
+    <w:link w:val="857"/>
     <w:uiPriority w:val="10"/>
     <w:qFormat/>
     <w:pPr>
@@ -34906,10 +35475,10 @@
       <w:szCs w:val="56"/>
     </w:rPr>
   </w:style>
-  <w:style w:type="character" w:styleId="851">
+  <w:style w:type="character" w:styleId="857">
     <w:name w:val="Title Char"/>
-    <w:basedOn w:val="840"/>
-    <w:link w:val="850"/>
+    <w:basedOn w:val="846"/>
+    <w:link w:val="856"/>
     <w:uiPriority w:val="10"/>
     <w:pPr>
       <w:pBdr/>
@@ -34923,11 +35492,11 @@
       <w:szCs w:val="56"/>
     </w:rPr>
   </w:style>
-  <w:style w:type="paragraph" w:styleId="852">
+  <w:style w:type="paragraph" w:styleId="858">
     <w:name w:val="Subtitle"/>
-    <w:basedOn w:val="890"/>
-    <w:next w:val="890"/>
-    <w:link w:val="853"/>
+    <w:basedOn w:val="896"/>
+    <w:next w:val="896"/>
+    <w:link w:val="859"/>
     <w:uiPriority w:val="11"/>
     <w:qFormat/>
     <w:pPr>
@@ -34945,10 +35514,10 @@
       <w:szCs w:val="28"/>
     </w:rPr>
   </w:style>
-  <w:style w:type="character" w:styleId="853">
+  <w:style w:type="character" w:styleId="859">
     <w:name w:val="Subtitle Char"/>
-    <w:basedOn w:val="840"/>
-    <w:link w:val="852"/>
+    <w:basedOn w:val="846"/>
+    <w:link w:val="858"/>
     <w:uiPriority w:val="11"/>
     <w:pPr>
       <w:pBdr/>
@@ -34962,11 +35531,11 @@
       <w:szCs w:val="28"/>
     </w:rPr>
   </w:style>
-  <w:style w:type="paragraph" w:styleId="854">
+  <w:style w:type="paragraph" w:styleId="860">
     <w:name w:val="Quote"/>
-    <w:basedOn w:val="890"/>
-    <w:next w:val="890"/>
-    <w:link w:val="855"/>
+    <w:basedOn w:val="896"/>
+    <w:next w:val="896"/>
+    <w:link w:val="861"/>
     <w:uiPriority w:val="29"/>
     <w:qFormat/>
     <w:pPr>
@@ -34981,10 +35550,10 @@
       <w:color w:val="404040" w:themeColor="text1" w:themeTint="BF"/>
     </w:rPr>
   </w:style>
-  <w:style w:type="character" w:styleId="855">
+  <w:style w:type="character" w:styleId="861">
     <w:name w:val="Quote Char"/>
-    <w:basedOn w:val="840"/>
-    <w:link w:val="854"/>
+    <w:basedOn w:val="846"/>
+    <w:link w:val="860"/>
     <w:uiPriority w:val="29"/>
     <w:pPr>
       <w:pBdr/>
@@ -34997,9 +35566,9 @@
       <w:color w:val="404040" w:themeColor="text1" w:themeTint="BF"/>
     </w:rPr>
   </w:style>
-  <w:style w:type="character" w:styleId="856">
+  <w:style w:type="character" w:styleId="862">
     <w:name w:val="Intense Emphasis"/>
-    <w:basedOn w:val="840"/>
+    <w:basedOn w:val="846"/>
     <w:uiPriority w:val="21"/>
     <w:qFormat/>
     <w:pPr>
@@ -35013,11 +35582,11 @@
       <w:color w:val="0f4761" w:themeColor="accent1" w:themeShade="BF"/>
     </w:rPr>
   </w:style>
-  <w:style w:type="paragraph" w:styleId="857">
+  <w:style w:type="paragraph" w:styleId="863">
     <w:name w:val="Intense Quote"/>
-    <w:basedOn w:val="890"/>
-    <w:next w:val="890"/>
-    <w:link w:val="858"/>
+    <w:basedOn w:val="896"/>
+    <w:next w:val="896"/>
+    <w:link w:val="864"/>
     <w:uiPriority w:val="30"/>
     <w:qFormat/>
     <w:pPr>
@@ -35035,10 +35604,10 @@
       <w:color w:val="0f4761" w:themeColor="accent1" w:themeShade="BF"/>
     </w:rPr>
   </w:style>
-  <w:style w:type="character" w:styleId="858">
+  <w:style w:type="character" w:styleId="864">
     <w:name w:val="Intense Quote Char"/>
-    <w:basedOn w:val="840"/>
-    <w:link w:val="857"/>
+    <w:basedOn w:val="846"/>
+    <w:link w:val="863"/>
     <w:uiPriority w:val="30"/>
     <w:pPr>
       <w:pBdr/>
@@ -35051,9 +35620,9 @@
       <w:color w:val="0f4761" w:themeColor="accent1" w:themeShade="BF"/>
     </w:rPr>
   </w:style>
-  <w:style w:type="character" w:styleId="859">
+  <w:style w:type="character" w:styleId="865">
     <w:name w:val="Intense Reference"/>
-    <w:basedOn w:val="840"/>
+    <w:basedOn w:val="846"/>
     <w:uiPriority w:val="32"/>
     <w:qFormat/>
     <w:pPr>
@@ -35069,9 +35638,9 @@
       <w:spacing w:val="5"/>
     </w:rPr>
   </w:style>
-  <w:style w:type="character" w:styleId="860">
+  <w:style w:type="character" w:styleId="866">
     <w:name w:val="Subtle Emphasis"/>
-    <w:basedOn w:val="840"/>
+    <w:basedOn w:val="846"/>
     <w:uiPriority w:val="19"/>
     <w:qFormat/>
     <w:pPr>
@@ -35085,9 +35654,9 @@
       <w:color w:val="404040" w:themeColor="text1" w:themeTint="BF"/>
     </w:rPr>
   </w:style>
-  <w:style w:type="character" w:styleId="861">
+  <w:style w:type="character" w:styleId="867">
     <w:name w:val="Emphasis"/>
-    <w:basedOn w:val="840"/>
+    <w:basedOn w:val="846"/>
     <w:uiPriority w:val="20"/>
     <w:qFormat/>
     <w:pPr>
@@ -35100,9 +35669,9 @@
       <w:iCs/>
     </w:rPr>
   </w:style>
-  <w:style w:type="character" w:styleId="862">
+  <w:style w:type="character" w:styleId="868">
     <w:name w:val="Strong"/>
-    <w:basedOn w:val="840"/>
+    <w:basedOn w:val="846"/>
     <w:uiPriority w:val="22"/>
     <w:qFormat/>
     <w:pPr>
@@ -35115,9 +35684,9 @@
       <w:bCs/>
     </w:rPr>
   </w:style>
-  <w:style w:type="character" w:styleId="863">
+  <w:style w:type="character" w:styleId="869">
     <w:name w:val="Subtle Reference"/>
-    <w:basedOn w:val="840"/>
+    <w:basedOn w:val="846"/>
     <w:uiPriority w:val="31"/>
     <w:qFormat/>
     <w:pPr>
@@ -35130,9 +35699,9 @@
       <w:color w:val="5a5a5a" w:themeColor="text1" w:themeTint="A5"/>
     </w:rPr>
   </w:style>
-  <w:style w:type="character" w:styleId="864">
+  <w:style w:type="character" w:styleId="870">
     <w:name w:val="Book Title"/>
-    <w:basedOn w:val="840"/>
+    <w:basedOn w:val="846"/>
     <w:uiPriority w:val="33"/>
     <w:qFormat/>
     <w:pPr>
@@ -35148,10 +35717,10 @@
       <w:spacing w:val="5"/>
     </w:rPr>
   </w:style>
-  <w:style w:type="paragraph" w:styleId="865">
+  <w:style w:type="paragraph" w:styleId="871">
     <w:name w:val="Header"/>
-    <w:basedOn w:val="890"/>
-    <w:link w:val="866"/>
+    <w:basedOn w:val="896"/>
+    <w:link w:val="872"/>
     <w:uiPriority w:val="99"/>
     <w:unhideWhenUsed/>
     <w:pPr>
@@ -35164,10 +35733,10 @@
       <w:ind/>
     </w:pPr>
   </w:style>
-  <w:style w:type="character" w:styleId="866">
+  <w:style w:type="character" w:styleId="872">
     <w:name w:val="Header Char"/>
-    <w:basedOn w:val="840"/>
-    <w:link w:val="865"/>
+    <w:basedOn w:val="846"/>
+    <w:link w:val="871"/>
     <w:uiPriority w:val="99"/>
     <w:pPr>
       <w:pBdr/>
@@ -35175,10 +35744,10 @@
       <w:ind/>
     </w:pPr>
   </w:style>
-  <w:style w:type="paragraph" w:styleId="867">
+  <w:style w:type="paragraph" w:styleId="873">
     <w:name w:val="Footer"/>
-    <w:basedOn w:val="890"/>
-    <w:link w:val="868"/>
+    <w:basedOn w:val="896"/>
+    <w:link w:val="874"/>
     <w:uiPriority w:val="99"/>
     <w:unhideWhenUsed/>
     <w:pPr>
@@ -35191,10 +35760,10 @@
       <w:ind/>
     </w:pPr>
   </w:style>
-  <w:style w:type="character" w:styleId="868">
+  <w:style w:type="character" w:styleId="874">
     <w:name w:val="Footer Char"/>
-    <w:basedOn w:val="840"/>
-    <w:link w:val="867"/>
+    <w:basedOn w:val="846"/>
+    <w:link w:val="873"/>
     <w:uiPriority w:val="99"/>
     <w:pPr>
       <w:pBdr/>
@@ -35202,10 +35771,10 @@
       <w:ind/>
     </w:pPr>
   </w:style>
-  <w:style w:type="paragraph" w:styleId="869">
+  <w:style w:type="paragraph" w:styleId="875">
     <w:name w:val="Caption"/>
-    <w:basedOn w:val="890"/>
-    <w:next w:val="890"/>
+    <w:basedOn w:val="896"/>
+    <w:next w:val="896"/>
     <w:uiPriority w:val="35"/>
     <w:unhideWhenUsed/>
     <w:qFormat/>
@@ -35222,10 +35791,10 @@
       <w:szCs w:val="18"/>
     </w:rPr>
   </w:style>
-  <w:style w:type="paragraph" w:styleId="870">
+  <w:style w:type="paragraph" w:styleId="876">
     <w:name w:val="footnote text"/>
-    <w:basedOn w:val="890"/>
-    <w:link w:val="871"/>
+    <w:basedOn w:val="896"/>
+    <w:link w:val="877"/>
     <w:uiPriority w:val="99"/>
     <w:semiHidden/>
     <w:unhideWhenUsed/>
@@ -35239,10 +35808,10 @@
       <w:szCs w:val="20"/>
     </w:rPr>
   </w:style>
-  <w:style w:type="character" w:styleId="871">
+  <w:style w:type="character" w:styleId="877">
     <w:name w:val="Footnote Text Char"/>
-    <w:basedOn w:val="840"/>
-    <w:link w:val="870"/>
+    <w:basedOn w:val="846"/>
+    <w:link w:val="876"/>
     <w:uiPriority w:val="99"/>
     <w:semiHidden/>
     <w:pPr>
@@ -35255,9 +35824,9 @@
       <w:szCs w:val="20"/>
     </w:rPr>
   </w:style>
-  <w:style w:type="character" w:styleId="872">
+  <w:style w:type="character" w:styleId="878">
     <w:name w:val="footnote reference"/>
-    <w:basedOn w:val="840"/>
+    <w:basedOn w:val="846"/>
     <w:uiPriority w:val="99"/>
     <w:semiHidden/>
     <w:unhideWhenUsed/>
@@ -35270,10 +35839,10 @@
       <w:vertAlign w:val="superscript"/>
     </w:rPr>
   </w:style>
-  <w:style w:type="paragraph" w:styleId="873">
+  <w:style w:type="paragraph" w:styleId="879">
     <w:name w:val="endnote text"/>
-    <w:basedOn w:val="890"/>
-    <w:link w:val="874"/>
+    <w:basedOn w:val="896"/>
+    <w:link w:val="880"/>
     <w:uiPriority w:val="99"/>
     <w:semiHidden/>
     <w:unhideWhenUsed/>
@@ -35287,10 +35856,10 @@
       <w:szCs w:val="20"/>
     </w:rPr>
   </w:style>
-  <w:style w:type="character" w:styleId="874">
+  <w:style w:type="character" w:styleId="880">
     <w:name w:val="Endnote Text Char"/>
-    <w:basedOn w:val="840"/>
-    <w:link w:val="873"/>
+    <w:basedOn w:val="846"/>
+    <w:link w:val="879"/>
     <w:uiPriority w:val="99"/>
     <w:semiHidden/>
     <w:pPr>
@@ -35303,9 +35872,9 @@
       <w:szCs w:val="20"/>
     </w:rPr>
   </w:style>
-  <w:style w:type="character" w:styleId="875">
+  <w:style w:type="character" w:styleId="881">
     <w:name w:val="endnote reference"/>
-    <w:basedOn w:val="840"/>
+    <w:basedOn w:val="846"/>
     <w:uiPriority w:val="99"/>
     <w:semiHidden/>
     <w:unhideWhenUsed/>
@@ -35318,9 +35887,9 @@
       <w:vertAlign w:val="superscript"/>
     </w:rPr>
   </w:style>
-  <w:style w:type="character" w:styleId="876">
+  <w:style w:type="character" w:styleId="882">
     <w:name w:val="Hyperlink"/>
-    <w:basedOn w:val="840"/>
+    <w:basedOn w:val="846"/>
     <w:uiPriority w:val="99"/>
     <w:unhideWhenUsed/>
     <w:pPr>
@@ -35333,9 +35902,9 @@
       <w:u w:val="single"/>
     </w:rPr>
   </w:style>
-  <w:style w:type="character" w:styleId="877">
+  <w:style w:type="character" w:styleId="883">
     <w:name w:val="FollowedHyperlink"/>
-    <w:basedOn w:val="840"/>
+    <w:basedOn w:val="846"/>
     <w:uiPriority w:val="99"/>
     <w:semiHidden/>
     <w:unhideWhenUsed/>
@@ -35349,10 +35918,10 @@
       <w:u w:val="single"/>
     </w:rPr>
   </w:style>
-  <w:style w:type="paragraph" w:styleId="878">
+  <w:style w:type="paragraph" w:styleId="884">
     <w:name w:val="toc 1"/>
-    <w:basedOn w:val="890"/>
-    <w:next w:val="890"/>
+    <w:basedOn w:val="896"/>
+    <w:next w:val="896"/>
     <w:uiPriority w:val="39"/>
     <w:unhideWhenUsed/>
     <w:pPr>
@@ -35361,10 +35930,10 @@
       <w:ind/>
     </w:pPr>
   </w:style>
-  <w:style w:type="paragraph" w:styleId="879">
+  <w:style w:type="paragraph" w:styleId="885">
     <w:name w:val="toc 2"/>
-    <w:basedOn w:val="890"/>
-    <w:next w:val="890"/>
+    <w:basedOn w:val="896"/>
+    <w:next w:val="896"/>
     <w:uiPriority w:val="39"/>
     <w:unhideWhenUsed/>
     <w:pPr>
@@ -35373,10 +35942,10 @@
       <w:ind w:left="220"/>
     </w:pPr>
   </w:style>
-  <w:style w:type="paragraph" w:styleId="880">
+  <w:style w:type="paragraph" w:styleId="886">
     <w:name w:val="toc 3"/>
-    <w:basedOn w:val="890"/>
-    <w:next w:val="890"/>
+    <w:basedOn w:val="896"/>
+    <w:next w:val="896"/>
     <w:uiPriority w:val="39"/>
     <w:unhideWhenUsed/>
     <w:pPr>
@@ -35385,10 +35954,10 @@
       <w:ind w:left="440"/>
     </w:pPr>
   </w:style>
-  <w:style w:type="paragraph" w:styleId="881">
+  <w:style w:type="paragraph" w:styleId="887">
     <w:name w:val="toc 4"/>
-    <w:basedOn w:val="890"/>
-    <w:next w:val="890"/>
+    <w:basedOn w:val="896"/>
+    <w:next w:val="896"/>
     <w:uiPriority w:val="39"/>
     <w:unhideWhenUsed/>
     <w:pPr>
@@ -35397,10 +35966,10 @@
       <w:ind w:left="660"/>
     </w:pPr>
   </w:style>
-  <w:style w:type="paragraph" w:styleId="882">
+  <w:style w:type="paragraph" w:styleId="888">
     <w:name w:val="toc 5"/>
-    <w:basedOn w:val="890"/>
-    <w:next w:val="890"/>
+    <w:basedOn w:val="896"/>
+    <w:next w:val="896"/>
     <w:uiPriority w:val="39"/>
     <w:unhideWhenUsed/>
     <w:pPr>
@@ -35409,10 +35978,10 @@
       <w:ind w:left="880"/>
     </w:pPr>
   </w:style>
-  <w:style w:type="paragraph" w:styleId="883">
+  <w:style w:type="paragraph" w:styleId="889">
     <w:name w:val="toc 6"/>
-    <w:basedOn w:val="890"/>
-    <w:next w:val="890"/>
+    <w:basedOn w:val="896"/>
+    <w:next w:val="896"/>
     <w:uiPriority w:val="39"/>
     <w:unhideWhenUsed/>
     <w:pPr>
@@ -35421,10 +35990,10 @@
       <w:ind w:left="1100"/>
     </w:pPr>
   </w:style>
-  <w:style w:type="paragraph" w:styleId="884">
+  <w:style w:type="paragraph" w:styleId="890">
     <w:name w:val="toc 7"/>
-    <w:basedOn w:val="890"/>
-    <w:next w:val="890"/>
+    <w:basedOn w:val="896"/>
+    <w:next w:val="896"/>
     <w:uiPriority w:val="39"/>
     <w:unhideWhenUsed/>
     <w:pPr>
@@ -35433,10 +36002,10 @@
       <w:ind w:left="1320"/>
     </w:pPr>
   </w:style>
-  <w:style w:type="paragraph" w:styleId="885">
+  <w:style w:type="paragraph" w:styleId="891">
     <w:name w:val="toc 8"/>
-    <w:basedOn w:val="890"/>
-    <w:next w:val="890"/>
+    <w:basedOn w:val="896"/>
+    <w:next w:val="896"/>
     <w:uiPriority w:val="39"/>
     <w:unhideWhenUsed/>
     <w:pPr>
@@ -35445,10 +36014,10 @@
       <w:ind w:left="1540"/>
     </w:pPr>
   </w:style>
-  <w:style w:type="paragraph" w:styleId="886">
+  <w:style w:type="paragraph" w:styleId="892">
     <w:name w:val="toc 9"/>
-    <w:basedOn w:val="890"/>
-    <w:next w:val="890"/>
+    <w:basedOn w:val="896"/>
+    <w:next w:val="896"/>
     <w:uiPriority w:val="39"/>
     <w:unhideWhenUsed/>
     <w:pPr>
@@ -35457,9 +36026,9 @@
       <w:ind w:left="1760"/>
     </w:pPr>
   </w:style>
-  <w:style w:type="character" w:styleId="887">
+  <w:style w:type="character" w:styleId="893">
     <w:name w:val="Placeholder Text"/>
-    <w:basedOn w:val="840"/>
+    <w:basedOn w:val="846"/>
     <w:uiPriority w:val="99"/>
     <w:semiHidden/>
     <w:pPr>
@@ -35471,7 +36040,7 @@
       <w:color w:val="666666"/>
     </w:rPr>
   </w:style>
-  <w:style w:type="paragraph" w:styleId="888">
+  <w:style w:type="paragraph" w:styleId="894">
     <w:name w:val="TOC Heading"/>
     <w:uiPriority w:val="39"/>
     <w:unhideWhenUsed/>
@@ -35481,10 +36050,10 @@
       <w:ind/>
     </w:pPr>
   </w:style>
-  <w:style w:type="paragraph" w:styleId="889">
+  <w:style w:type="paragraph" w:styleId="895">
     <w:name w:val="table of figures"/>
-    <w:basedOn w:val="890"/>
-    <w:next w:val="890"/>
+    <w:basedOn w:val="896"/>
+    <w:next w:val="896"/>
     <w:uiPriority w:val="99"/>
     <w:unhideWhenUsed/>
     <w:pPr>
@@ -35493,7 +36062,7 @@
       <w:ind/>
     </w:pPr>
   </w:style>
-  <w:style w:type="paragraph" w:styleId="890" w:default="1">
+  <w:style w:type="paragraph" w:styleId="896" w:default="1">
     <w:name w:val="Normal"/>
     <w:qFormat/>
     <w:pPr>
@@ -35502,7 +36071,7 @@
       <w:ind/>
     </w:pPr>
   </w:style>
-  <w:style w:type="table" w:styleId="891" w:default="1">
+  <w:style w:type="table" w:styleId="897" w:default="1">
     <w:name w:val="Normal Table"/>
     <w:uiPriority w:val="99"/>
     <w:semiHidden/>
@@ -35695,7 +36264,7 @@
       </w:tcPr>
     </w:tblStylePr>
   </w:style>
-  <w:style w:type="numbering" w:styleId="892" w:default="1">
+  <w:style w:type="numbering" w:styleId="898" w:default="1">
     <w:name w:val="No List"/>
     <w:uiPriority w:val="99"/>
     <w:semiHidden/>
@@ -35706,9 +36275,9 @@
       <w:ind/>
     </w:pPr>
   </w:style>
-  <w:style w:type="paragraph" w:styleId="893">
+  <w:style w:type="paragraph" w:styleId="899">
     <w:name w:val="No Spacing"/>
-    <w:basedOn w:val="890"/>
+    <w:basedOn w:val="896"/>
     <w:uiPriority w:val="1"/>
     <w:qFormat/>
     <w:pPr>
@@ -35717,9 +36286,9 @@
       <w:ind/>
     </w:pPr>
   </w:style>
-  <w:style w:type="paragraph" w:styleId="894">
+  <w:style w:type="paragraph" w:styleId="900">
     <w:name w:val="List Paragraph"/>
-    <w:basedOn w:val="890"/>
+    <w:basedOn w:val="896"/>
     <w:uiPriority w:val="34"/>
     <w:qFormat/>
     <w:pPr>

</xml_diff>